<commit_message>
Fix Learner Guide layout: cap diagram width at 6.1in and restart step numbering per activity
Diagrams previously overflowed the right page margin, and the List Number
style continued numbering across the whole document (activity steps appeared
as 81-88 rather than 1-8).

Co-Authored-By: Claude Fable 5 <noreply@anthropic.com>
</commit_message>
<xml_diff>
--- a/courseware/LG-Fast-Track Innovations with Agile Design Thinking and GenAI.docx
+++ b/courseware/LG-Fast-Track Innovations with Agile Design Thinking and GenAI.docx
@@ -551,7 +551,7 @@
         </w:rPr>
         <w:t>Your Generative AI Assistant</w:t>
         <w:tab/>
-        <w:t>7</w:t>
+        <w:t>8</w:t>
       </w:r>
     </w:p>
     <w:p>
@@ -630,7 +630,7 @@
         </w:rPr>
         <w:t>The Double Diamond</w:t>
         <w:tab/>
-        <w:t>11</w:t>
+        <w:t>10</w:t>
       </w:r>
     </w:p>
     <w:p>
@@ -650,7 +650,7 @@
         </w:rPr>
         <w:t>The Five Stages of Design Thinking</w:t>
         <w:tab/>
-        <w:t>12</w:t>
+        <w:t>11</w:t>
       </w:r>
     </w:p>
     <w:p>
@@ -670,7 +670,7 @@
         </w:rPr>
         <w:t>Wicked Problems</w:t>
         <w:tab/>
-        <w:t>13</w:t>
+        <w:t>12</w:t>
       </w:r>
     </w:p>
     <w:p>
@@ -690,7 +690,7 @@
         </w:rPr>
         <w:t>How Generative AI Enhances the Loop</w:t>
         <w:tab/>
-        <w:t>14</w:t>
+        <w:t>12</w:t>
       </w:r>
     </w:p>
     <w:p>
@@ -710,7 +710,7 @@
         </w:rPr>
         <w:t>Latest Trends in Innovation</w:t>
         <w:tab/>
-        <w:t>15</w:t>
+        <w:t>13</w:t>
       </w:r>
     </w:p>
     <w:p>
@@ -729,7 +729,7 @@
         </w:rPr>
         <w:t>Topic 2 — Problem Framing and Ideation: Leveraging Design Thinking and Generative AI</w:t>
         <w:tab/>
-        <w:t>15</w:t>
+        <w:t>13</w:t>
       </w:r>
     </w:p>
     <w:p>
@@ -749,7 +749,7 @@
         </w:rPr>
         <w:t>Framing the Design Challenge</w:t>
         <w:tab/>
-        <w:t>15</w:t>
+        <w:t>14</w:t>
       </w:r>
     </w:p>
     <w:p>
@@ -769,7 +769,7 @@
         </w:rPr>
         <w:t>Problem Statement, Point of View and How Might We</w:t>
         <w:tab/>
-        <w:t>16</w:t>
+        <w:t>14</w:t>
       </w:r>
     </w:p>
     <w:p>
@@ -789,7 +789,7 @@
         </w:rPr>
         <w:t>The Problem-Assumption Model</w:t>
         <w:tab/>
-        <w:t>17</w:t>
+        <w:t>15</w:t>
       </w:r>
     </w:p>
     <w:p>
@@ -809,7 +809,7 @@
         </w:rPr>
         <w:t>Empathy Maps</w:t>
         <w:tab/>
-        <w:t>18</w:t>
+        <w:t>16</w:t>
       </w:r>
     </w:p>
     <w:p>
@@ -829,7 +829,7 @@
         </w:rPr>
         <w:t>Persona Mapping</w:t>
         <w:tab/>
-        <w:t>19</w:t>
+        <w:t>17</w:t>
       </w:r>
     </w:p>
     <w:p>
@@ -849,7 +849,7 @@
         </w:rPr>
         <w:t>Ideation Techniques</w:t>
         <w:tab/>
-        <w:t>19</w:t>
+        <w:t>17</w:t>
       </w:r>
     </w:p>
     <w:p>
@@ -869,7 +869,7 @@
         </w:rPr>
         <w:t>Prototyping and Testing</w:t>
         <w:tab/>
-        <w:t>20</w:t>
+        <w:t>18</w:t>
       </w:r>
     </w:p>
     <w:p>
@@ -888,7 +888,7 @@
         </w:rPr>
         <w:t>Topic 3 — Agile Development and AI for Rapid Solution Delivery</w:t>
         <w:tab/>
-        <w:t>20</w:t>
+        <w:t>18</w:t>
       </w:r>
     </w:p>
     <w:p>
@@ -908,7 +908,7 @@
         </w:rPr>
         <w:t>Being Agile versus Doing Agile</w:t>
         <w:tab/>
-        <w:t>20</w:t>
+        <w:t>18</w:t>
       </w:r>
     </w:p>
     <w:p>
@@ -928,7 +928,7 @@
         </w:rPr>
         <w:t>Scrum</w:t>
         <w:tab/>
-        <w:t>21</w:t>
+        <w:t>19</w:t>
       </w:r>
     </w:p>
     <w:p>
@@ -948,7 +948,7 @@
         </w:rPr>
         <w:t>Dual-Track Agile</w:t>
         <w:tab/>
-        <w:t>22</w:t>
+        <w:t>20</w:t>
       </w:r>
     </w:p>
     <w:p>
@@ -968,7 +968,7 @@
         </w:rPr>
         <w:t>Converting Ideas into Agile Artefacts</w:t>
         <w:tab/>
-        <w:t>23</w:t>
+        <w:t>21</w:t>
       </w:r>
     </w:p>
     <w:p>
@@ -988,7 +988,7 @@
         </w:rPr>
         <w:t>Release Prioritisation — The Three-Cake Model</w:t>
         <w:tab/>
-        <w:t>24</w:t>
+        <w:t>22</w:t>
       </w:r>
     </w:p>
     <w:p>
@@ -1008,7 +1008,7 @@
         </w:rPr>
         <w:t>Agile Estimation</w:t>
         <w:tab/>
-        <w:t>24</w:t>
+        <w:t>22</w:t>
       </w:r>
     </w:p>
     <w:p>
@@ -1028,7 +1028,7 @@
         </w:rPr>
         <w:t>Ceremonies, Artefacts and Information Radiators</w:t>
         <w:tab/>
-        <w:t>25</w:t>
+        <w:t>23</w:t>
       </w:r>
     </w:p>
     <w:p>
@@ -1048,7 +1048,7 @@
         </w:rPr>
         <w:t>GenAI Across the Sprint</w:t>
         <w:tab/>
-        <w:t>26</w:t>
+        <w:t>23</w:t>
       </w:r>
     </w:p>
     <w:p>
@@ -1067,7 +1067,7 @@
         </w:rPr>
         <w:t>Topic 4 — Scaling and Sustaining Innovations with Agile Design Thinking and Generative AI</w:t>
         <w:tab/>
-        <w:t>26</w:t>
+        <w:t>24</w:t>
       </w:r>
     </w:p>
     <w:p>
@@ -1087,7 +1087,7 @@
         </w:rPr>
         <w:t>The Three Levers That Actually Scale Innovation</w:t>
         <w:tab/>
-        <w:t>26</w:t>
+        <w:t>24</w:t>
       </w:r>
     </w:p>
     <w:p>
@@ -1107,7 +1107,7 @@
         </w:rPr>
         <w:t>Culture — The Four Principles</w:t>
         <w:tab/>
-        <w:t>26</w:t>
+        <w:t>24</w:t>
       </w:r>
     </w:p>
     <w:p>
@@ -1127,7 +1127,7 @@
         </w:rPr>
         <w:t>Engaging Stakeholders and Creating Buy-In</w:t>
         <w:tab/>
-        <w:t>27</w:t>
+        <w:t>25</w:t>
       </w:r>
     </w:p>
     <w:p>
@@ -1147,7 +1147,7 @@
         </w:rPr>
         <w:t>Resource Management in Innovation Projects</w:t>
         <w:tab/>
-        <w:t>27</w:t>
+        <w:t>25</w:t>
       </w:r>
     </w:p>
     <w:p>
@@ -1167,7 +1167,7 @@
         </w:rPr>
         <w:t>Sensemaking</w:t>
         <w:tab/>
-        <w:t>28</w:t>
+        <w:t>26</w:t>
       </w:r>
     </w:p>
     <w:p>
@@ -1187,7 +1187,7 @@
         </w:rPr>
         <w:t>Systems Thinking</w:t>
         <w:tab/>
-        <w:t>28</w:t>
+        <w:t>26</w:t>
       </w:r>
     </w:p>
     <w:p>
@@ -1207,7 +1207,7 @@
         </w:rPr>
         <w:t>Metrics and KPIs for Innovation</w:t>
         <w:tab/>
-        <w:t>30</w:t>
+        <w:t>27</w:t>
       </w:r>
     </w:p>
     <w:p>
@@ -1226,7 +1226,7 @@
         </w:rPr>
         <w:t>Hands-On Activities</w:t>
         <w:tab/>
-        <w:t>31</w:t>
+        <w:t>29</w:t>
       </w:r>
     </w:p>
     <w:p>
@@ -1246,7 +1246,7 @@
         </w:rPr>
         <w:t>Activity 1 — Airbnb — Diagnosing Why a Method Alone Does Not Save a Business</w:t>
         <w:tab/>
-        <w:t>32</w:t>
+        <w:t>29</w:t>
       </w:r>
     </w:p>
     <w:p>
@@ -1266,7 +1266,7 @@
         </w:rPr>
         <w:t>Activity 2 — Netflix vs Blockbuster — Innovation as an Operating System</w:t>
         <w:tab/>
-        <w:t>33</w:t>
+        <w:t>31</w:t>
       </w:r>
     </w:p>
     <w:p>
@@ -1286,7 +1286,7 @@
         </w:rPr>
         <w:t>Activity 3 — Positioning GenAI in the Innovation Loop — Where It Helps and Where It Lies</w:t>
         <w:tab/>
-        <w:t>35</w:t>
+        <w:t>33</w:t>
       </w:r>
     </w:p>
     <w:p>
@@ -1306,7 +1306,7 @@
         </w:rPr>
         <w:t>Activity 4 — GE Adventure Series — Reframing the Problem Instead of Fixing the Machine</w:t>
         <w:tab/>
-        <w:t>37</w:t>
+        <w:t>35</w:t>
       </w:r>
     </w:p>
     <w:p>
@@ -1326,7 +1326,7 @@
         </w:rPr>
         <w:t>Activity 5 — IDEO Shopping Cart — Volume, Then Judgement</w:t>
         <w:tab/>
-        <w:t>39</w:t>
+        <w:t>37</w:t>
       </w:r>
     </w:p>
     <w:p>
@@ -1346,7 +1346,7 @@
         </w:rPr>
         <w:t>Activity 6 — Rapid Prototyping with AI — From Concept to Testable Artefact in One Hour</w:t>
         <w:tab/>
-        <w:t>41</w:t>
+        <w:t>39</w:t>
       </w:r>
     </w:p>
     <w:p>
@@ -1366,7 +1366,7 @@
         </w:rPr>
         <w:t>Activity 7 — Spotify — Reading a Scaling Model Honestly</w:t>
         <w:tab/>
-        <w:t>43</w:t>
+        <w:t>41</w:t>
       </w:r>
     </w:p>
     <w:p>
@@ -1386,7 +1386,7 @@
         </w:rPr>
         <w:t>Activity 8 — From Hills to Backlog — Converting Ideas into Stories with GenAI</w:t>
         <w:tab/>
-        <w:t>45</w:t>
+        <w:t>43</w:t>
       </w:r>
     </w:p>
     <w:p>
@@ -1406,7 +1406,7 @@
         </w:rPr>
         <w:t>Activity 9 — Running Dual-Track Agile — A Sprint Simulation with AI Assistance</w:t>
         <w:tab/>
-        <w:t>47</w:t>
+        <w:t>45</w:t>
       </w:r>
     </w:p>
     <w:p>
@@ -1426,7 +1426,7 @@
         </w:rPr>
         <w:t>Activity 10 — DBS Bank — Scaling Innovation Across 25,000 People</w:t>
         <w:tab/>
-        <w:t>49</w:t>
+        <w:t>47</w:t>
       </w:r>
     </w:p>
     <w:p>
@@ -1446,7 +1446,7 @@
         </w:rPr>
         <w:t>Activity 11 — Boeing 737 MAX — Systems Thinking and the Cost of Local Optimisation</w:t>
         <w:tab/>
-        <w:t>51</w:t>
+        <w:t>49</w:t>
       </w:r>
     </w:p>
     <w:p>
@@ -1466,7 +1466,7 @@
         </w:rPr>
         <w:t>Activity 12 — Innovation Metrics — Designing KPIs That Change a Decision</w:t>
         <w:tab/>
-        <w:t>53</w:t>
+        <w:t>52</w:t>
       </w:r>
     </w:p>
     <w:p>
@@ -1485,7 +1485,7 @@
         </w:rPr>
         <w:t>Preparing for the Assessment</w:t>
         <w:tab/>
-        <w:t>55</w:t>
+        <w:t>54</w:t>
       </w:r>
     </w:p>
     <w:p>
@@ -1504,7 +1504,7 @@
         </w:rPr>
         <w:t>Glossary</w:t>
         <w:tab/>
-        <w:t>56</w:t>
+        <w:t>55</w:t>
       </w:r>
     </w:p>
     <w:p>
@@ -1523,7 +1523,7 @@
         </w:rPr>
         <w:t>References and Further Reading</w:t>
         <w:tab/>
-        <w:t>58</w:t>
+        <w:t>57</w:t>
       </w:r>
     </w:p>
     <w:p>
@@ -1781,48 +1781,84 @@
     </w:p>
     <w:p>
       <w:pPr>
-        <w:pStyle w:val="ListNumber"/>
-      </w:pPr>
+        <w:ind w:left="432"/>
+      </w:pPr>
+      <w:r>
+        <w:rPr>
+          <w:b/>
+        </w:rPr>
+        <w:t xml:space="preserve">1. </w:t>
+      </w:r>
       <w:r>
         <w:t>Open https://alfredang.github.io/designthinking/ in your browser.</w:t>
       </w:r>
     </w:p>
     <w:p>
       <w:pPr>
-        <w:pStyle w:val="ListNumber"/>
-      </w:pPr>
+        <w:ind w:left="432"/>
+      </w:pPr>
+      <w:r>
+        <w:rPr>
+          <w:b/>
+        </w:rPr>
+        <w:t xml:space="preserve">2. </w:t>
+      </w:r>
       <w:r>
         <w:t>The trainer clicks Create New Workspace and shares the workspace code, the link, or a QR code (via the Share button).</w:t>
       </w:r>
     </w:p>
     <w:p>
       <w:pPr>
-        <w:pStyle w:val="ListNumber"/>
-      </w:pPr>
+        <w:ind w:left="432"/>
+      </w:pPr>
+      <w:r>
+        <w:rPr>
+          <w:b/>
+        </w:rPr>
+        <w:t xml:space="preserve">3. </w:t>
+      </w:r>
       <w:r>
         <w:t>Enter the workspace code in the 'Enter workspace code' field and click Join Workspace.</w:t>
       </w:r>
     </w:p>
     <w:p>
       <w:pPr>
-        <w:pStyle w:val="ListNumber"/>
-      </w:pPr>
+        <w:ind w:left="432"/>
+      </w:pPr>
+      <w:r>
+        <w:rPr>
+          <w:b/>
+        </w:rPr>
+        <w:t xml:space="preserve">4. </w:t>
+      </w:r>
       <w:r>
         <w:t>Enter your display name when prompted, then click Continue. Your name appears on every note you post.</w:t>
       </w:r>
     </w:p>
     <w:p>
       <w:pPr>
-        <w:pStyle w:val="ListNumber"/>
-      </w:pPr>
+        <w:ind w:left="432"/>
+      </w:pPr>
+      <w:r>
+        <w:rPr>
+          <w:b/>
+        </w:rPr>
+        <w:t xml:space="preserve">5. </w:t>
+      </w:r>
       <w:r>
         <w:t>Use the stage stepper across the top to move between Empathize, Define, Ideate, Prototype and Test.</w:t>
       </w:r>
     </w:p>
     <w:p>
       <w:pPr>
-        <w:pStyle w:val="ListNumber"/>
-      </w:pPr>
+        <w:ind w:left="432"/>
+      </w:pPr>
+      <w:r>
+        <w:rPr>
+          <w:b/>
+        </w:rPr>
+        <w:t xml:space="preserve">6. </w:t>
+      </w:r>
       <w:r>
         <w:t>Inside any section click Add note, then fill in the Title, the Description and an optional Category, and click Save.</w:t>
       </w:r>
@@ -2085,56 +2121,98 @@
     </w:p>
     <w:p>
       <w:pPr>
-        <w:pStyle w:val="ListNumber"/>
-      </w:pPr>
+        <w:ind w:left="432"/>
+      </w:pPr>
+      <w:r>
+        <w:rPr>
+          <w:b/>
+        </w:rPr>
+        <w:t xml:space="preserve">1. </w:t>
+      </w:r>
       <w:r>
         <w:t>Open https://alfredang.github.io/padlet/ in your browser.</w:t>
       </w:r>
     </w:p>
     <w:p>
       <w:pPr>
-        <w:pStyle w:val="ListNumber"/>
-      </w:pPr>
+        <w:ind w:left="432"/>
+      </w:pPr>
+      <w:r>
+        <w:rPr>
+          <w:b/>
+        </w:rPr>
+        <w:t xml:space="preserve">2. </w:t>
+      </w:r>
       <w:r>
         <w:t>The trainer creates the classroom and shares the classroom code.</w:t>
       </w:r>
     </w:p>
     <w:p>
       <w:pPr>
-        <w:pStyle w:val="ListNumber"/>
-      </w:pPr>
+        <w:ind w:left="432"/>
+      </w:pPr>
+      <w:r>
+        <w:rPr>
+          <w:b/>
+        </w:rPr>
+        <w:t xml:space="preserve">3. </w:t>
+      </w:r>
       <w:r>
         <w:t>Click Join an existing classroom, enter the classroom code and click Join classroom.</w:t>
       </w:r>
     </w:p>
     <w:p>
       <w:pPr>
-        <w:pStyle w:val="ListNumber"/>
-      </w:pPr>
+        <w:ind w:left="432"/>
+      </w:pPr>
+      <w:r>
+        <w:rPr>
+          <w:b/>
+        </w:rPr>
+        <w:t xml:space="preserve">4. </w:t>
+      </w:r>
       <w:r>
         <w:t>Enter your display name so your posts are attributed to you.</w:t>
       </w:r>
     </w:p>
     <w:p>
       <w:pPr>
-        <w:pStyle w:val="ListNumber"/>
-      </w:pPr>
+        <w:ind w:left="432"/>
+      </w:pPr>
+      <w:r>
+        <w:rPr>
+          <w:b/>
+        </w:rPr>
+        <w:t xml:space="preserve">5. </w:t>
+      </w:r>
       <w:r>
         <w:t>Find the section for the current activity, then click + / Add post here.</w:t>
       </w:r>
     </w:p>
     <w:p>
       <w:pPr>
-        <w:pStyle w:val="ListNumber"/>
-      </w:pPr>
+        <w:ind w:left="432"/>
+      </w:pPr>
+      <w:r>
+        <w:rPr>
+          <w:b/>
+        </w:rPr>
+        <w:t xml:space="preserve">6. </w:t>
+      </w:r>
       <w:r>
         <w:t>Give the post a Subject and body. You may attach an image, a link, a YouTube video or a PDF.</w:t>
       </w:r>
     </w:p>
     <w:p>
       <w:pPr>
-        <w:pStyle w:val="ListNumber"/>
-      </w:pPr>
+        <w:ind w:left="432"/>
+      </w:pPr>
+      <w:r>
+        <w:rPr>
+          <w:b/>
+        </w:rPr>
+        <w:t xml:space="preserve">7. </w:t>
+      </w:r>
       <w:r>
         <w:t>Use Like on the strongest posts from other groups, and Comments to challenge their reasoning.</w:t>
       </w:r>
@@ -2309,7 +2387,7 @@
       <w:r>
         <w:drawing>
           <wp:inline xmlns:a="http://schemas.openxmlformats.org/drawingml/2006/main" xmlns:pic="http://schemas.openxmlformats.org/drawingml/2006/picture">
-            <wp:extent cx="8113776" cy="4687824"/>
+            <wp:extent cx="5577840" cy="3222659"/>
             <wp:docPr id="2" name="Picture 2"/>
             <wp:cNvGraphicFramePr>
               <a:graphicFrameLocks noChangeAspect="1"/>
@@ -2330,7 +2408,7 @@
                   <pic:spPr>
                     <a:xfrm>
                       <a:off x="0" y="0"/>
-                      <a:ext cx="8113776" cy="4687824"/>
+                      <a:ext cx="5577840" cy="3222659"/>
                     </a:xfrm>
                     <a:prstGeom prst="rect"/>
                   </pic:spPr>
@@ -2867,7 +2945,7 @@
       <w:r>
         <w:drawing>
           <wp:inline xmlns:a="http://schemas.openxmlformats.org/drawingml/2006/main" xmlns:pic="http://schemas.openxmlformats.org/drawingml/2006/picture">
-            <wp:extent cx="9113520" cy="4120896"/>
+            <wp:extent cx="5577840" cy="2522154"/>
             <wp:docPr id="3" name="Picture 3"/>
             <wp:cNvGraphicFramePr>
               <a:graphicFrameLocks noChangeAspect="1"/>
@@ -2888,7 +2966,7 @@
                   <pic:spPr>
                     <a:xfrm>
                       <a:off x="0" y="0"/>
-                      <a:ext cx="9113520" cy="4120896"/>
+                      <a:ext cx="5577840" cy="2522154"/>
                     </a:xfrm>
                     <a:prstGeom prst="rect"/>
                   </pic:spPr>
@@ -2989,7 +3067,7 @@
       <w:r>
         <w:drawing>
           <wp:inline xmlns:a="http://schemas.openxmlformats.org/drawingml/2006/main" xmlns:pic="http://schemas.openxmlformats.org/drawingml/2006/picture">
-            <wp:extent cx="9107424" cy="3346704"/>
+            <wp:extent cx="5577840" cy="2049688"/>
             <wp:docPr id="4" name="Picture 4"/>
             <wp:cNvGraphicFramePr>
               <a:graphicFrameLocks noChangeAspect="1"/>
@@ -3010,7 +3088,7 @@
                   <pic:spPr>
                     <a:xfrm>
                       <a:off x="0" y="0"/>
-                      <a:ext cx="9107424" cy="3346704"/>
+                      <a:ext cx="5577840" cy="2049688"/>
                     </a:xfrm>
                     <a:prstGeom prst="rect"/>
                   </pic:spPr>
@@ -3147,7 +3225,7 @@
       <w:r>
         <w:drawing>
           <wp:inline xmlns:a="http://schemas.openxmlformats.org/drawingml/2006/main" xmlns:pic="http://schemas.openxmlformats.org/drawingml/2006/picture">
-            <wp:extent cx="9107424" cy="3980688"/>
+            <wp:extent cx="5577840" cy="2437972"/>
             <wp:docPr id="5" name="Picture 5"/>
             <wp:cNvGraphicFramePr>
               <a:graphicFrameLocks noChangeAspect="1"/>
@@ -3168,7 +3246,7 @@
                   <pic:spPr>
                     <a:xfrm>
                       <a:off x="0" y="0"/>
-                      <a:ext cx="9107424" cy="3980688"/>
+                      <a:ext cx="5577840" cy="2437972"/>
                     </a:xfrm>
                     <a:prstGeom prst="rect"/>
                   </pic:spPr>
@@ -3644,48 +3722,84 @@
     </w:p>
     <w:p>
       <w:pPr>
-        <w:pStyle w:val="ListNumber"/>
-      </w:pPr>
+        <w:ind w:left="432"/>
+      </w:pPr>
+      <w:r>
+        <w:rPr>
+          <w:b/>
+        </w:rPr>
+        <w:t xml:space="preserve">1. </w:t>
+      </w:r>
       <w:r>
         <w:t>Write your design challenge — one short, memorable sentence conveying the problem you want to solve. For example: make families spend more time together.</w:t>
       </w:r>
     </w:p>
     <w:p>
       <w:pPr>
-        <w:pStyle w:val="ListNumber"/>
-      </w:pPr>
+        <w:ind w:left="432"/>
+      </w:pPr>
+      <w:r>
+        <w:rPr>
+          <w:b/>
+        </w:rPr>
+        <w:t xml:space="preserve">2. </w:t>
+      </w:r>
       <w:r>
         <w:t>Frame it as a question, specifically a 'How Might We' question. For example: How might we help families spend more time together?</w:t>
       </w:r>
     </w:p>
     <w:p>
       <w:pPr>
-        <w:pStyle w:val="ListNumber"/>
-      </w:pPr>
+        <w:ind w:left="432"/>
+      </w:pPr>
+      <w:r>
+        <w:rPr>
+          <w:b/>
+        </w:rPr>
+        <w:t xml:space="preserve">3. </w:t>
+      </w:r>
       <w:r>
         <w:t>Define the impact you would like to have in light of that challenge.</w:t>
       </w:r>
     </w:p>
     <w:p>
       <w:pPr>
-        <w:pStyle w:val="ListNumber"/>
-      </w:pPr>
+        <w:ind w:left="432"/>
+      </w:pPr>
+      <w:r>
+        <w:rPr>
+          <w:b/>
+        </w:rPr>
+        <w:t xml:space="preserve">4. </w:t>
+      </w:r>
       <w:r>
         <w:t>Think about possible solutions to the problem — without committing to any of them yet.</w:t>
       </w:r>
     </w:p>
     <w:p>
       <w:pPr>
-        <w:pStyle w:val="ListNumber"/>
-      </w:pPr>
+        <w:ind w:left="432"/>
+      </w:pPr>
+      <w:r>
+        <w:rPr>
+          <w:b/>
+        </w:rPr>
+        <w:t xml:space="preserve">5. </w:t>
+      </w:r>
       <w:r>
         <w:t>Write down the context and the constraints that surround the original question.</w:t>
       </w:r>
     </w:p>
     <w:p>
       <w:pPr>
-        <w:pStyle w:val="ListNumber"/>
-      </w:pPr>
+        <w:ind w:left="432"/>
+      </w:pPr>
+      <w:r>
+        <w:rPr>
+          <w:b/>
+        </w:rPr>
+        <w:t xml:space="preserve">6. </w:t>
+      </w:r>
       <w:r>
         <w:t>Look back at your How Might We question and revise it. It is very common to adapt it as you dig deeper.</w:t>
       </w:r>
@@ -4007,7 +4121,7 @@
       <w:r>
         <w:drawing>
           <wp:inline xmlns:a="http://schemas.openxmlformats.org/drawingml/2006/main" xmlns:pic="http://schemas.openxmlformats.org/drawingml/2006/picture">
-            <wp:extent cx="8540496" cy="3279648"/>
+            <wp:extent cx="5577840" cy="2141954"/>
             <wp:docPr id="6" name="Picture 6"/>
             <wp:cNvGraphicFramePr>
               <a:graphicFrameLocks noChangeAspect="1"/>
@@ -4028,7 +4142,7 @@
                   <pic:spPr>
                     <a:xfrm>
                       <a:off x="0" y="0"/>
-                      <a:ext cx="8540496" cy="3279648"/>
+                      <a:ext cx="5577840" cy="2141954"/>
                     </a:xfrm>
                     <a:prstGeom prst="rect"/>
                   </pic:spPr>
@@ -4059,32 +4173,56 @@
     </w:p>
     <w:p>
       <w:pPr>
-        <w:pStyle w:val="ListNumber"/>
-      </w:pPr>
+        <w:ind w:left="432"/>
+      </w:pPr>
+      <w:r>
+        <w:rPr>
+          <w:b/>
+        </w:rPr>
+        <w:t xml:space="preserve">1. </w:t>
+      </w:r>
       <w:r>
         <w:t>What's the problem?</w:t>
       </w:r>
     </w:p>
     <w:p>
       <w:pPr>
-        <w:pStyle w:val="ListNumber"/>
-      </w:pPr>
+        <w:ind w:left="432"/>
+      </w:pPr>
+      <w:r>
+        <w:rPr>
+          <w:b/>
+        </w:rPr>
+        <w:t xml:space="preserve">2. </w:t>
+      </w:r>
       <w:r>
         <w:t>How might we solve it?</w:t>
       </w:r>
     </w:p>
     <w:p>
       <w:pPr>
-        <w:pStyle w:val="ListNumber"/>
-      </w:pPr>
+        <w:ind w:left="432"/>
+      </w:pPr>
+      <w:r>
+        <w:rPr>
+          <w:b/>
+        </w:rPr>
+        <w:t xml:space="preserve">3. </w:t>
+      </w:r>
       <w:r>
         <w:t>What assumptions have we made?</w:t>
       </w:r>
     </w:p>
     <w:p>
       <w:pPr>
-        <w:pStyle w:val="ListNumber"/>
-      </w:pPr>
+        <w:ind w:left="432"/>
+      </w:pPr>
+      <w:r>
+        <w:rPr>
+          <w:b/>
+        </w:rPr>
+        <w:t xml:space="preserve">4. </w:t>
+      </w:r>
       <w:r>
         <w:t>How will we test our assumptions?</w:t>
       </w:r>
@@ -4124,7 +4262,7 @@
       <w:r>
         <w:drawing>
           <wp:inline xmlns:a="http://schemas.openxmlformats.org/drawingml/2006/main" xmlns:pic="http://schemas.openxmlformats.org/drawingml/2006/picture">
-            <wp:extent cx="7126224" cy="4120896"/>
+            <wp:extent cx="5577840" cy="3225509"/>
             <wp:docPr id="7" name="Picture 7"/>
             <wp:cNvGraphicFramePr>
               <a:graphicFrameLocks noChangeAspect="1"/>
@@ -4145,7 +4283,7 @@
                   <pic:spPr>
                     <a:xfrm>
                       <a:off x="0" y="0"/>
-                      <a:ext cx="7126224" cy="4120896"/>
+                      <a:ext cx="5577840" cy="3225509"/>
                     </a:xfrm>
                     <a:prstGeom prst="rect"/>
                   </pic:spPr>
@@ -4970,7 +5108,7 @@
       <w:r>
         <w:drawing>
           <wp:inline xmlns:a="http://schemas.openxmlformats.org/drawingml/2006/main" xmlns:pic="http://schemas.openxmlformats.org/drawingml/2006/picture">
-            <wp:extent cx="8827008" cy="3560064"/>
+            <wp:extent cx="5577840" cy="2249626"/>
             <wp:docPr id="8" name="Picture 8"/>
             <wp:cNvGraphicFramePr>
               <a:graphicFrameLocks noChangeAspect="1"/>
@@ -4991,7 +5129,7 @@
                   <pic:spPr>
                     <a:xfrm>
                       <a:off x="0" y="0"/>
-                      <a:ext cx="8827008" cy="3560064"/>
+                      <a:ext cx="5577840" cy="2249626"/>
                     </a:xfrm>
                     <a:prstGeom prst="rect"/>
                   </pic:spPr>
@@ -5126,7 +5264,7 @@
       <w:r>
         <w:drawing>
           <wp:inline xmlns:a="http://schemas.openxmlformats.org/drawingml/2006/main" xmlns:pic="http://schemas.openxmlformats.org/drawingml/2006/picture">
-            <wp:extent cx="8967216" cy="3980688"/>
+            <wp:extent cx="5577840" cy="2476091"/>
             <wp:docPr id="9" name="Picture 9"/>
             <wp:cNvGraphicFramePr>
               <a:graphicFrameLocks noChangeAspect="1"/>
@@ -5147,7 +5285,7 @@
                   <pic:spPr>
                     <a:xfrm>
                       <a:off x="0" y="0"/>
-                      <a:ext cx="8967216" cy="3980688"/>
+                      <a:ext cx="5577840" cy="2476091"/>
                     </a:xfrm>
                     <a:prstGeom prst="rect"/>
                   </pic:spPr>
@@ -5231,32 +5369,56 @@
     </w:p>
     <w:p>
       <w:pPr>
-        <w:pStyle w:val="ListNumber"/>
-      </w:pPr>
+        <w:ind w:left="432"/>
+      </w:pPr>
+      <w:r>
+        <w:rPr>
+          <w:b/>
+        </w:rPr>
+        <w:t xml:space="preserve">1. </w:t>
+      </w:r>
       <w:r>
         <w:t>'Discovery comes first, then delivery.' No — both run continuously and simultaneously. Discovery is a necessary part of product development, practised with the same agile and lean principles.</w:t>
       </w:r>
     </w:p>
     <w:p>
       <w:pPr>
-        <w:pStyle w:val="ListNumber"/>
-      </w:pPr>
+        <w:ind w:left="432"/>
+      </w:pPr>
+      <w:r>
+        <w:rPr>
+          <w:b/>
+        </w:rPr>
+        <w:t xml:space="preserve">2. </w:t>
+      </w:r>
       <w:r>
         <w:t>'All work flows from discovery into development.' No — ideas are frequently abandoned during discovery.</w:t>
       </w:r>
     </w:p>
     <w:p>
       <w:pPr>
-        <w:pStyle w:val="ListNumber"/>
-      </w:pPr>
+        <w:ind w:left="432"/>
+      </w:pPr>
+      <w:r>
+        <w:rPr>
+          <w:b/>
+        </w:rPr>
+        <w:t xml:space="preserve">3. </w:t>
+      </w:r>
       <w:r>
         <w:t>'They are separate teams.' No — a product manager, designer and senior engineer may lead discovery, but they must involve the whole team wherever possible.</w:t>
       </w:r>
     </w:p>
     <w:p>
       <w:pPr>
-        <w:pStyle w:val="ListNumber"/>
-      </w:pPr>
+        <w:ind w:left="432"/>
+      </w:pPr>
+      <w:r>
+        <w:rPr>
+          <w:b/>
+        </w:rPr>
+        <w:t xml:space="preserve">4. </w:t>
+      </w:r>
       <w:r>
         <w:t>'Discovery ends at launch.' No — keep measuring and learning after you ship.</w:t>
       </w:r>
@@ -5667,7 +5829,7 @@
       <w:r>
         <w:drawing>
           <wp:inline xmlns:a="http://schemas.openxmlformats.org/drawingml/2006/main" xmlns:pic="http://schemas.openxmlformats.org/drawingml/2006/picture">
-            <wp:extent cx="8400288" cy="3840480"/>
+            <wp:extent cx="5577840" cy="2550101"/>
             <wp:docPr id="10" name="Picture 10"/>
             <wp:cNvGraphicFramePr>
               <a:graphicFrameLocks noChangeAspect="1"/>
@@ -5688,7 +5850,7 @@
                   <pic:spPr>
                     <a:xfrm>
                       <a:off x="0" y="0"/>
-                      <a:ext cx="8400288" cy="3840480"/>
+                      <a:ext cx="5577840" cy="2550101"/>
                     </a:xfrm>
                     <a:prstGeom prst="rect"/>
                   </pic:spPr>
@@ -6135,32 +6297,56 @@
     </w:p>
     <w:p>
       <w:pPr>
-        <w:pStyle w:val="ListNumber"/>
-      </w:pPr>
+        <w:ind w:left="432"/>
+      </w:pPr>
+      <w:r>
+        <w:rPr>
+          <w:b/>
+        </w:rPr>
+        <w:t xml:space="preserve">1. </w:t>
+      </w:r>
       <w:r>
         <w:t>People over process — assemble people around a shared mission rather than a bureaucratic structure, and prioritise real-time collaboration.</w:t>
       </w:r>
     </w:p>
     <w:p>
       <w:pPr>
-        <w:pStyle w:val="ListNumber"/>
-      </w:pPr>
+        <w:ind w:left="432"/>
+      </w:pPr>
+      <w:r>
+        <w:rPr>
+          <w:b/>
+        </w:rPr>
+        <w:t xml:space="preserve">2. </w:t>
+      </w:r>
       <w:r>
         <w:t>Creativity and innovation — allow personal freedom for self-expression, encourage smart risk-taking, and build exploration time into the workflow.</w:t>
       </w:r>
     </w:p>
     <w:p>
       <w:pPr>
-        <w:pStyle w:val="ListNumber"/>
-      </w:pPr>
+        <w:ind w:left="432"/>
+      </w:pPr>
+      <w:r>
+        <w:rPr>
+          <w:b/>
+        </w:rPr>
+        <w:t xml:space="preserve">3. </w:t>
+      </w:r>
       <w:r>
         <w:t>Iteration, prototyping and adaptation — replace year-long waterfall-style projects with low-fidelity versions tested in real environments.</w:t>
       </w:r>
     </w:p>
     <w:p>
       <w:pPr>
-        <w:pStyle w:val="ListNumber"/>
-      </w:pPr>
+        <w:ind w:left="432"/>
+      </w:pPr>
+      <w:r>
+        <w:rPr>
+          <w:b/>
+        </w:rPr>
+        <w:t xml:space="preserve">4. </w:t>
+      </w:r>
       <w:r>
         <w:t>Multi-disciplinary autonomous teams — self-managing cross-functional teams with genuine local decision-making authority beat hierarchical structures.</w:t>
       </w:r>
@@ -6434,7 +6620,7 @@
       <w:r>
         <w:drawing>
           <wp:inline xmlns:a="http://schemas.openxmlformats.org/drawingml/2006/main" xmlns:pic="http://schemas.openxmlformats.org/drawingml/2006/picture">
-            <wp:extent cx="8400288" cy="3627120"/>
+            <wp:extent cx="5577840" cy="2408429"/>
             <wp:docPr id="11" name="Picture 11"/>
             <wp:cNvGraphicFramePr>
               <a:graphicFrameLocks noChangeAspect="1"/>
@@ -6455,7 +6641,7 @@
                   <pic:spPr>
                     <a:xfrm>
                       <a:off x="0" y="0"/>
-                      <a:ext cx="8400288" cy="3627120"/>
+                      <a:ext cx="5577840" cy="2408429"/>
                     </a:xfrm>
                     <a:prstGeom prst="rect"/>
                   </pic:spPr>
@@ -6930,7 +7116,7 @@
       <w:r>
         <w:drawing>
           <wp:inline xmlns:a="http://schemas.openxmlformats.org/drawingml/2006/main" xmlns:pic="http://schemas.openxmlformats.org/drawingml/2006/picture">
-            <wp:extent cx="7833360" cy="4120896"/>
+            <wp:extent cx="5577840" cy="2934335"/>
             <wp:docPr id="12" name="Picture 12"/>
             <wp:cNvGraphicFramePr>
               <a:graphicFrameLocks noChangeAspect="1"/>
@@ -6951,7 +7137,7 @@
                   <pic:spPr>
                     <a:xfrm>
                       <a:off x="0" y="0"/>
-                      <a:ext cx="7833360" cy="4120896"/>
+                      <a:ext cx="5577840" cy="2934335"/>
                     </a:xfrm>
                     <a:prstGeom prst="rect"/>
                   </pic:spPr>
@@ -7063,7 +7249,7 @@
       <w:r>
         <w:drawing>
           <wp:inline xmlns:a="http://schemas.openxmlformats.org/drawingml/2006/main" xmlns:pic="http://schemas.openxmlformats.org/drawingml/2006/picture">
-            <wp:extent cx="8260080" cy="3419856"/>
+            <wp:extent cx="5577840" cy="2309349"/>
             <wp:docPr id="13" name="Picture 13"/>
             <wp:cNvGraphicFramePr>
               <a:graphicFrameLocks noChangeAspect="1"/>
@@ -7084,7 +7270,7 @@
                   <pic:spPr>
                     <a:xfrm>
                       <a:off x="0" y="0"/>
-                      <a:ext cx="8260080" cy="3419856"/>
+                      <a:ext cx="5577840" cy="2309349"/>
                     </a:xfrm>
                     <a:prstGeom prst="rect"/>
                   </pic:spPr>
@@ -7289,64 +7475,112 @@
     </w:p>
     <w:p>
       <w:pPr>
-        <w:pStyle w:val="ListNumber"/>
-      </w:pPr>
+        <w:ind w:left="432"/>
+      </w:pPr>
+      <w:r>
+        <w:rPr>
+          <w:b/>
+        </w:rPr>
+        <w:t xml:space="preserve">1. </w:t>
+      </w:r>
       <w:r>
         <w:t>Trainer creates the Padlet classroom and shares the classroom code and QR with the class.</w:t>
       </w:r>
     </w:p>
     <w:p>
       <w:pPr>
-        <w:pStyle w:val="ListNumber"/>
-      </w:pPr>
+        <w:ind w:left="432"/>
+      </w:pPr>
+      <w:r>
+        <w:rPr>
+          <w:b/>
+        </w:rPr>
+        <w:t xml:space="preserve">2. </w:t>
+      </w:r>
       <w:r>
         <w:t>Join the Padlet board at https://alfredang.github.io/padlet/ using the classroom code and your display name.</w:t>
       </w:r>
     </w:p>
     <w:p>
       <w:pPr>
-        <w:pStyle w:val="ListNumber"/>
-      </w:pPr>
+        <w:ind w:left="432"/>
+      </w:pPr>
+      <w:r>
+        <w:rPr>
+          <w:b/>
+        </w:rPr>
+        <w:t xml:space="preserve">3. </w:t>
+      </w:r>
       <w:r>
         <w:t>Read the Airbnb case in the Learner Guide (Activity 1) with your group of 3–5.</w:t>
       </w:r>
     </w:p>
     <w:p>
       <w:pPr>
-        <w:pStyle w:val="ListNumber"/>
-      </w:pPr>
+        <w:ind w:left="432"/>
+      </w:pPr>
+      <w:r>
+        <w:rPr>
+          <w:b/>
+        </w:rPr>
+        <w:t xml:space="preserve">4. </w:t>
+      </w:r>
       <w:r>
         <w:t>In the section 'Right Problem', post what the real problem was and the evidence for it.</w:t>
       </w:r>
     </w:p>
     <w:p>
       <w:pPr>
-        <w:pStyle w:val="ListNumber"/>
-      </w:pPr>
+        <w:ind w:left="432"/>
+      </w:pPr>
+      <w:r>
+        <w:rPr>
+          <w:b/>
+        </w:rPr>
+        <w:t xml:space="preserve">5. </w:t>
+      </w:r>
       <w:r>
         <w:t>In the section 'Right Solution', post how the founders validated cheaply before scaling.</w:t>
       </w:r>
     </w:p>
     <w:p>
       <w:pPr>
-        <w:pStyle w:val="ListNumber"/>
-      </w:pPr>
+        <w:ind w:left="432"/>
+      </w:pPr>
+      <w:r>
+        <w:rPr>
+          <w:b/>
+        </w:rPr>
+        <w:t xml:space="preserve">6. </w:t>
+      </w:r>
       <w:r>
         <w:t>In the section 'Build It Right', post what Agile delivery would look like once the insight is proven.</w:t>
       </w:r>
     </w:p>
     <w:p>
       <w:pPr>
-        <w:pStyle w:val="ListNumber"/>
-      </w:pPr>
+        <w:ind w:left="432"/>
+      </w:pPr>
+      <w:r>
+        <w:rPr>
+          <w:b/>
+        </w:rPr>
+        <w:t xml:space="preserve">7. </w:t>
+      </w:r>
       <w:r>
         <w:t>Use ChatGPT to stress-test your position: paste your problem statement and ask it to argue the opposite case.</w:t>
       </w:r>
     </w:p>
     <w:p>
       <w:pPr>
-        <w:pStyle w:val="ListNumber"/>
-      </w:pPr>
+        <w:ind w:left="432"/>
+      </w:pPr>
+      <w:r>
+        <w:rPr>
+          <w:b/>
+        </w:rPr>
+        <w:t xml:space="preserve">8. </w:t>
+      </w:r>
       <w:r>
         <w:t>Post your group's one-sentence recommendation for the marketplace platform, then Like the two strongest posts from other groups.</w:t>
       </w:r>
@@ -7363,40 +7597,70 @@
     </w:p>
     <w:p>
       <w:pPr>
-        <w:pStyle w:val="ListNumber"/>
-      </w:pPr>
+        <w:ind w:left="432"/>
+      </w:pPr>
+      <w:r>
+        <w:rPr>
+          <w:b/>
+        </w:rPr>
+        <w:t xml:space="preserve">1. </w:t>
+      </w:r>
       <w:r>
         <w:t>Which of the three disciplines — Design Thinking, Lean or Agile — actually produced the photography insight, and why could the other two not have produced it?</w:t>
       </w:r>
     </w:p>
     <w:p>
       <w:pPr>
-        <w:pStyle w:val="ListNumber"/>
-      </w:pPr>
+        <w:ind w:left="432"/>
+      </w:pPr>
+      <w:r>
+        <w:rPr>
+          <w:b/>
+        </w:rPr>
+        <w:t xml:space="preserve">2. </w:t>
+      </w:r>
       <w:r>
         <w:t>The founders did something deliberately unscalable. When is 'do things that don't scale' the right innovation strategy, and when is it an excuse to avoid rigour?</w:t>
       </w:r>
     </w:p>
     <w:p>
       <w:pPr>
-        <w:pStyle w:val="ListNumber"/>
-      </w:pPr>
+        <w:ind w:left="432"/>
+      </w:pPr>
+      <w:r>
+        <w:rPr>
+          <w:b/>
+        </w:rPr>
+        <w:t xml:space="preserve">3. </w:t>
+      </w:r>
       <w:r>
         <w:t>Map the story onto the Double Diamond. Where does 'fly to New York and meet the hosts' sit — Discover, Define, Develop or Deliver?</w:t>
       </w:r>
     </w:p>
     <w:p>
       <w:pPr>
-        <w:pStyle w:val="ListNumber"/>
-      </w:pPr>
+        <w:ind w:left="432"/>
+      </w:pPr>
+      <w:r>
+        <w:rPr>
+          <w:b/>
+        </w:rPr>
+        <w:t xml:space="preserve">4. </w:t>
+      </w:r>
       <w:r>
         <w:t>Your engineers want to A/B test the checkout button. Write the one question you would ask them to expose whether they are solving the right problem.</w:t>
       </w:r>
     </w:p>
     <w:p>
       <w:pPr>
-        <w:pStyle w:val="ListNumber"/>
-      </w:pPr>
+        <w:ind w:left="432"/>
+      </w:pPr>
+      <w:r>
+        <w:rPr>
+          <w:b/>
+        </w:rPr>
+        <w:t xml:space="preserve">5. </w:t>
+      </w:r>
       <w:r>
         <w:t>How would you have used GenAI here — and what part of this story could GenAI NOT have done for you?</w:t>
       </w:r>
@@ -7532,48 +7796,84 @@
     </w:p>
     <w:p>
       <w:pPr>
-        <w:pStyle w:val="ListNumber"/>
-      </w:pPr>
+        <w:ind w:left="432"/>
+      </w:pPr>
+      <w:r>
+        <w:rPr>
+          <w:b/>
+        </w:rPr>
+        <w:t xml:space="preserve">1. </w:t>
+      </w:r>
       <w:r>
         <w:t>Rejoin the Padlet classroom board and open the Activity 2 section.</w:t>
       </w:r>
     </w:p>
     <w:p>
       <w:pPr>
-        <w:pStyle w:val="ListNumber"/>
-      </w:pPr>
+        <w:ind w:left="432"/>
+      </w:pPr>
+      <w:r>
+        <w:rPr>
+          <w:b/>
+        </w:rPr>
+        <w:t xml:space="preserve">2. </w:t>
+      </w:r>
       <w:r>
         <w:t>In your group, list every Blockbuster metric you can infer from the case in the sub-section 'What they measured'.</w:t>
       </w:r>
     </w:p>
     <w:p>
       <w:pPr>
-        <w:pStyle w:val="ListNumber"/>
-      </w:pPr>
+        <w:ind w:left="432"/>
+      </w:pPr>
+      <w:r>
+        <w:rPr>
+          <w:b/>
+        </w:rPr>
+        <w:t xml:space="preserve">3. </w:t>
+      </w:r>
       <w:r>
         <w:t>Post one metric from your own organisation that quietly protects the status quo.</w:t>
       </w:r>
     </w:p>
     <w:p>
       <w:pPr>
-        <w:pStyle w:val="ListNumber"/>
-      </w:pPr>
+        <w:ind w:left="432"/>
+      </w:pPr>
+      <w:r>
+        <w:rPr>
+          <w:b/>
+        </w:rPr>
+        <w:t xml:space="preserve">4. </w:t>
+      </w:r>
       <w:r>
         <w:t>Ask ChatGPT: 'What early signals should a DVD rental chain have tracked in 2000 to detect streaming disruption?' and evaluate whether those signals were knowable then.</w:t>
       </w:r>
     </w:p>
     <w:p>
       <w:pPr>
-        <w:pStyle w:val="ListNumber"/>
-      </w:pPr>
+        <w:ind w:left="432"/>
+      </w:pPr>
+      <w:r>
+        <w:rPr>
+          <w:b/>
+        </w:rPr>
+        <w:t xml:space="preserve">5. </w:t>
+      </w:r>
       <w:r>
         <w:t>Post your group's answer to 'what we would have to STOP measuring to innovate honestly'.</w:t>
       </w:r>
     </w:p>
     <w:p>
       <w:pPr>
-        <w:pStyle w:val="ListNumber"/>
-      </w:pPr>
+        <w:ind w:left="432"/>
+      </w:pPr>
+      <w:r>
+        <w:rPr>
+          <w:b/>
+        </w:rPr>
+        <w:t xml:space="preserve">6. </w:t>
+      </w:r>
       <w:r>
         <w:t>Comment on another group's post, naming one risk in their proposal.</w:t>
       </w:r>
@@ -7590,40 +7890,70 @@
     </w:p>
     <w:p>
       <w:pPr>
-        <w:pStyle w:val="ListNumber"/>
-      </w:pPr>
+        <w:ind w:left="432"/>
+      </w:pPr>
+      <w:r>
+        <w:rPr>
+          <w:b/>
+        </w:rPr>
+        <w:t xml:space="preserve">1. </w:t>
+      </w:r>
       <w:r>
         <w:t>Blockbuster's late fees were both its profit engine and its biggest customer pain point. What is the equivalent in your own organisation?</w:t>
       </w:r>
     </w:p>
     <w:p>
       <w:pPr>
-        <w:pStyle w:val="ListNumber"/>
-      </w:pPr>
+        <w:ind w:left="432"/>
+      </w:pPr>
+      <w:r>
+        <w:rPr>
+          <w:b/>
+        </w:rPr>
+        <w:t xml:space="preserve">2. </w:t>
+      </w:r>
       <w:r>
         <w:t>Netflix cannibalised two of its own successful businesses. What made that organisationally possible, and what would block it where you work?</w:t>
       </w:r>
     </w:p>
     <w:p>
       <w:pPr>
-        <w:pStyle w:val="ListNumber"/>
-      </w:pPr>
+        <w:ind w:left="432"/>
+      </w:pPr>
+      <w:r>
+        <w:rPr>
+          <w:b/>
+        </w:rPr>
+        <w:t xml:space="preserve">3. </w:t>
+      </w:r>
       <w:r>
         <w:t>'Measure things that matter' — what was Blockbuster measuring that made the decision to decline look rational at the time?</w:t>
       </w:r>
     </w:p>
     <w:p>
       <w:pPr>
-        <w:pStyle w:val="ListNumber"/>
-      </w:pPr>
+        <w:ind w:left="432"/>
+      </w:pPr>
+      <w:r>
+        <w:rPr>
+          <w:b/>
+        </w:rPr>
+        <w:t xml:space="preserve">4. </w:t>
+      </w:r>
       <w:r>
         <w:t>Was Blockbuster's failure a failure of ideas, of execution, or of the operating system around both? Defend your answer.</w:t>
       </w:r>
     </w:p>
     <w:p>
       <w:pPr>
-        <w:pStyle w:val="ListNumber"/>
-      </w:pPr>
+        <w:ind w:left="432"/>
+      </w:pPr>
+      <w:r>
+        <w:rPr>
+          <w:b/>
+        </w:rPr>
+        <w:t xml:space="preserve">5. </w:t>
+      </w:r>
       <w:r>
         <w:t>Where could GenAI have given Blockbuster early warning, and would leadership have believed it?</w:t>
       </w:r>
@@ -7759,56 +8089,98 @@
     </w:p>
     <w:p>
       <w:pPr>
-        <w:pStyle w:val="ListNumber"/>
-      </w:pPr>
+        <w:ind w:left="432"/>
+      </w:pPr>
+      <w:r>
+        <w:rPr>
+          <w:b/>
+        </w:rPr>
+        <w:t xml:space="preserve">1. </w:t>
+      </w:r>
       <w:r>
         <w:t>Open ChatGPT or Microsoft Copilot.</w:t>
       </w:r>
     </w:p>
     <w:p>
       <w:pPr>
-        <w:pStyle w:val="ListNumber"/>
-      </w:pPr>
+        <w:ind w:left="432"/>
+      </w:pPr>
+      <w:r>
+        <w:rPr>
+          <w:b/>
+        </w:rPr>
+        <w:t xml:space="preserve">2. </w:t>
+      </w:r>
       <w:r>
         <w:t>Prompt: 'Create 3 detailed user personas for a savings product aimed at gig-economy workers in Singapore. Include name, age, income pattern, goals, frustrations and a representative quote.'</w:t>
       </w:r>
     </w:p>
     <w:p>
       <w:pPr>
-        <w:pStyle w:val="ListNumber"/>
-      </w:pPr>
+        <w:ind w:left="432"/>
+      </w:pPr>
+      <w:r>
+        <w:rPr>
+          <w:b/>
+        </w:rPr>
+        <w:t xml:space="preserve">3. </w:t>
+      </w:r>
       <w:r>
         <w:t>Read the output as a group and mark every claim that is an assumption rather than evidence.</w:t>
       </w:r>
     </w:p>
     <w:p>
       <w:pPr>
-        <w:pStyle w:val="ListNumber"/>
-      </w:pPr>
+        <w:ind w:left="432"/>
+      </w:pPr>
+      <w:r>
+        <w:rPr>
+          <w:b/>
+        </w:rPr>
+        <w:t xml:space="preserve">4. </w:t>
+      </w:r>
       <w:r>
         <w:t>Prompt the AI again: 'For each persona, list what evidence would be required to confirm it, and what would falsify it.'</w:t>
       </w:r>
     </w:p>
     <w:p>
       <w:pPr>
-        <w:pStyle w:val="ListNumber"/>
-      </w:pPr>
+        <w:ind w:left="432"/>
+      </w:pPr>
+      <w:r>
+        <w:rPr>
+          <w:b/>
+        </w:rPr>
+        <w:t xml:space="preserve">5. </w:t>
+      </w:r>
       <w:r>
         <w:t>Compare the two outputs — note how much more useful the second framing is.</w:t>
       </w:r>
     </w:p>
     <w:p>
       <w:pPr>
-        <w:pStyle w:val="ListNumber"/>
-      </w:pPr>
+        <w:ind w:left="432"/>
+      </w:pPr>
+      <w:r>
+        <w:rPr>
+          <w:b/>
+        </w:rPr>
+        <w:t xml:space="preserve">6. </w:t>
+      </w:r>
       <w:r>
         <w:t>Draft your group's one-sentence rule for using GenAI in discovery and post it to the Padlet Activity 3 section.</w:t>
       </w:r>
     </w:p>
     <w:p>
       <w:pPr>
-        <w:pStyle w:val="ListNumber"/>
-      </w:pPr>
+        <w:ind w:left="432"/>
+      </w:pPr>
+      <w:r>
+        <w:rPr>
+          <w:b/>
+        </w:rPr>
+        <w:t xml:space="preserve">7. </w:t>
+      </w:r>
       <w:r>
         <w:t>Like the rule you find most defensible from another group and comment why.</w:t>
       </w:r>
@@ -7825,40 +8197,70 @@
     </w:p>
     <w:p>
       <w:pPr>
-        <w:pStyle w:val="ListNumber"/>
-      </w:pPr>
+        <w:ind w:left="432"/>
+      </w:pPr>
+      <w:r>
+        <w:rPr>
+          <w:b/>
+        </w:rPr>
+        <w:t xml:space="preserve">1. </w:t>
+      </w:r>
       <w:r>
         <w:t>The AI personas were plausible but wrong. What property of large language models makes fluent output a poor proxy for truth?</w:t>
       </w:r>
     </w:p>
     <w:p>
       <w:pPr>
-        <w:pStyle w:val="ListNumber"/>
-      </w:pPr>
+        <w:ind w:left="432"/>
+      </w:pPr>
+      <w:r>
+        <w:rPr>
+          <w:b/>
+        </w:rPr>
+        <w:t xml:space="preserve">2. </w:t>
+      </w:r>
       <w:r>
         <w:t>Which parts of the design thinking loop can GenAI genuinely accelerate, and which parts must stay human? Draw the line and justify it.</w:t>
       </w:r>
     </w:p>
     <w:p>
       <w:pPr>
-        <w:pStyle w:val="ListNumber"/>
-      </w:pPr>
+        <w:ind w:left="432"/>
+      </w:pPr>
+      <w:r>
+        <w:rPr>
+          <w:b/>
+        </w:rPr>
+        <w:t xml:space="preserve">3. </w:t>
+      </w:r>
       <w:r>
         <w:t>Your colleague says the interviews can be skipped. Give the strongest version of their argument, then rebut it.</w:t>
       </w:r>
     </w:p>
     <w:p>
       <w:pPr>
-        <w:pStyle w:val="ListNumber"/>
-      </w:pPr>
+        <w:ind w:left="432"/>
+      </w:pPr>
+      <w:r>
+        <w:rPr>
+          <w:b/>
+        </w:rPr>
+        <w:t xml:space="preserve">4. </w:t>
+      </w:r>
       <w:r>
         <w:t>How would you make an AI-generated persona falsifiable — what evidence would prove it wrong?</w:t>
       </w:r>
     </w:p>
     <w:p>
       <w:pPr>
-        <w:pStyle w:val="ListNumber"/>
-      </w:pPr>
+        <w:ind w:left="432"/>
+      </w:pPr>
+      <w:r>
+        <w:rPr>
+          <w:b/>
+        </w:rPr>
+        <w:t xml:space="preserve">5. </w:t>
+      </w:r>
       <w:r>
         <w:t>What governance would you put in place so AI-generated insight is always labelled as unvalidated?</w:t>
       </w:r>
@@ -7994,64 +8396,112 @@
     </w:p>
     <w:p>
       <w:pPr>
-        <w:pStyle w:val="ListNumber"/>
-      </w:pPr>
+        <w:ind w:left="432"/>
+      </w:pPr>
+      <w:r>
+        <w:rPr>
+          <w:b/>
+        </w:rPr>
+        <w:t xml:space="preserve">1. </w:t>
+      </w:r>
       <w:r>
         <w:t>Trainer clicks Create New Workspace at https://alfredang.github.io/designthinking/ and shares the workspace code or QR.</w:t>
       </w:r>
     </w:p>
     <w:p>
       <w:pPr>
-        <w:pStyle w:val="ListNumber"/>
-      </w:pPr>
+        <w:ind w:left="432"/>
+      </w:pPr>
+      <w:r>
+        <w:rPr>
+          <w:b/>
+        </w:rPr>
+        <w:t xml:space="preserve">2. </w:t>
+      </w:r>
       <w:r>
         <w:t>Click Join Workspace, enter the code and your display name.</w:t>
       </w:r>
     </w:p>
     <w:p>
       <w:pPr>
-        <w:pStyle w:val="ListNumber"/>
-      </w:pPr>
+        <w:ind w:left="432"/>
+      </w:pPr>
+      <w:r>
+        <w:rPr>
+          <w:b/>
+        </w:rPr>
+        <w:t xml:space="preserve">3. </w:t>
+      </w:r>
       <w:r>
         <w:t>Open the Empathize stage. In Empathy Map, post to Says, Thinks, Does and Feels for an elderly patient who skipped a screening.</w:t>
       </w:r>
     </w:p>
     <w:p>
       <w:pPr>
-        <w:pStyle w:val="ListNumber"/>
-      </w:pPr>
+        <w:ind w:left="432"/>
+      </w:pPr>
+      <w:r>
+        <w:rPr>
+          <w:b/>
+        </w:rPr>
+        <w:t xml:space="preserve">4. </w:t>
+      </w:r>
       <w:r>
         <w:t>Post at least two entries into User Pain Points that are NOT about forgetting the appointment.</w:t>
       </w:r>
     </w:p>
     <w:p>
       <w:pPr>
-        <w:pStyle w:val="ListNumber"/>
-      </w:pPr>
+        <w:ind w:left="432"/>
+      </w:pPr>
+      <w:r>
+        <w:rPr>
+          <w:b/>
+        </w:rPr>
+        <w:t xml:space="preserve">5. </w:t>
+      </w:r>
       <w:r>
         <w:t>Move to the Define stage. In Problem Statement, write a POV: '[User] needs [need] because [insight]'.</w:t>
       </w:r>
     </w:p>
     <w:p>
       <w:pPr>
-        <w:pStyle w:val="ListNumber"/>
-      </w:pPr>
+        <w:ind w:left="432"/>
+      </w:pPr>
+      <w:r>
+        <w:rPr>
+          <w:b/>
+        </w:rPr>
+        <w:t xml:space="preserve">6. </w:t>
+      </w:r>
       <w:r>
         <w:t>In How Might We Questions, post three HMW questions at different altitudes.</w:t>
       </w:r>
     </w:p>
     <w:p>
       <w:pPr>
-        <w:pStyle w:val="ListNumber"/>
-      </w:pPr>
+        <w:ind w:left="432"/>
+      </w:pPr>
+      <w:r>
+        <w:rPr>
+          <w:b/>
+        </w:rPr>
+        <w:t xml:space="preserve">7. </w:t>
+      </w:r>
       <w:r>
         <w:t>Use ChatGPT to generate five more HMW variants, then post only the ones that pass the altitude test.</w:t>
       </w:r>
     </w:p>
     <w:p>
       <w:pPr>
-        <w:pStyle w:val="ListNumber"/>
-      </w:pPr>
+        <w:ind w:left="432"/>
+      </w:pPr>
+      <w:r>
+        <w:rPr>
+          <w:b/>
+        </w:rPr>
+        <w:t xml:space="preserve">8. </w:t>
+      </w:r>
       <w:r>
         <w:t>Vote on the HMW questions using the voting control; the top-voted question carries into Activity 5.</w:t>
       </w:r>
@@ -8068,40 +8518,70 @@
     </w:p>
     <w:p>
       <w:pPr>
-        <w:pStyle w:val="ListNumber"/>
-      </w:pPr>
+        <w:ind w:left="432"/>
+      </w:pPr>
+      <w:r>
+        <w:rPr>
+          <w:b/>
+        </w:rPr>
+        <w:t xml:space="preserve">1. </w:t>
+      </w:r>
       <w:r>
         <w:t>The engineering brief was 'make the scanner quieter'. Dietz's brief was different. State both as problem statements and explain what the reframe unlocked.</w:t>
       </w:r>
     </w:p>
     <w:p>
       <w:pPr>
-        <w:pStyle w:val="ListNumber"/>
-      </w:pPr>
+        <w:ind w:left="432"/>
+      </w:pPr>
+      <w:r>
+        <w:rPr>
+          <w:b/>
+        </w:rPr>
+        <w:t xml:space="preserve">2. </w:t>
+      </w:r>
       <w:r>
         <w:t>GE changed the experience, not the technology. In the polyclinic scenario, what is the 'paint the scanner' equivalent — and what is the 'make it quieter' trap?</w:t>
       </w:r>
     </w:p>
     <w:p>
       <w:pPr>
-        <w:pStyle w:val="ListNumber"/>
-      </w:pPr>
+        <w:ind w:left="432"/>
+      </w:pPr>
+      <w:r>
+        <w:rPr>
+          <w:b/>
+        </w:rPr>
+        <w:t xml:space="preserve">3. </w:t>
+      </w:r>
       <w:r>
         <w:t>Write a How Might We that is too broad, one that is too narrow, and one that is just right. What makes the third one workable?</w:t>
       </w:r>
     </w:p>
     <w:p>
       <w:pPr>
-        <w:pStyle w:val="ListNumber"/>
-      </w:pPr>
+        <w:ind w:left="432"/>
+      </w:pPr>
+      <w:r>
+        <w:rPr>
+          <w:b/>
+        </w:rPr>
+        <w:t xml:space="preserve">4. </w:t>
+      </w:r>
       <w:r>
         <w:t>Whose perspective is missing from an empathy map built only from the operations team's data?</w:t>
       </w:r>
     </w:p>
     <w:p>
       <w:pPr>
-        <w:pStyle w:val="ListNumber"/>
-      </w:pPr>
+        <w:ind w:left="432"/>
+      </w:pPr>
+      <w:r>
+        <w:rPr>
+          <w:b/>
+        </w:rPr>
+        <w:t xml:space="preserve">5. </w:t>
+      </w:r>
       <w:r>
         <w:t>Sedation rate was the number that proved the redesign worked. What single number would prove your polyclinic solution worked?</w:t>
       </w:r>
@@ -8237,64 +8717,112 @@
     </w:p>
     <w:p>
       <w:pPr>
-        <w:pStyle w:val="ListNumber"/>
-      </w:pPr>
+        <w:ind w:left="432"/>
+      </w:pPr>
+      <w:r>
+        <w:rPr>
+          <w:b/>
+        </w:rPr>
+        <w:t xml:space="preserve">1. </w:t>
+      </w:r>
       <w:r>
         <w:t>Open the Ideate stage in the Design Thinking Studio workspace.</w:t>
       </w:r>
     </w:p>
     <w:p>
       <w:pPr>
-        <w:pStyle w:val="ListNumber"/>
-      </w:pPr>
+        <w:ind w:left="432"/>
+      </w:pPr>
+      <w:r>
+        <w:rPr>
+          <w:b/>
+        </w:rPr>
+        <w:t xml:space="preserve">2. </w:t>
+      </w:r>
       <w:r>
         <w:t>Round 1 — silent, manual. Each person posts at least four ideas into Brainstorming Board. No discussion, no judging.</w:t>
       </w:r>
     </w:p>
     <w:p>
       <w:pPr>
-        <w:pStyle w:val="ListNumber"/>
-      </w:pPr>
+        <w:ind w:left="432"/>
+      </w:pPr>
+      <w:r>
+        <w:rPr>
+          <w:b/>
+        </w:rPr>
+        <w:t xml:space="preserve">3. </w:t>
+      </w:r>
       <w:r>
         <w:t>Round 2 — Crazy 8s. Eight rapid variations on the most promising idea, posted into Crazy 8s Ideas.</w:t>
       </w:r>
     </w:p>
     <w:p>
       <w:pPr>
-        <w:pStyle w:val="ListNumber"/>
-      </w:pPr>
+        <w:ind w:left="432"/>
+      </w:pPr>
+      <w:r>
+        <w:rPr>
+          <w:b/>
+        </w:rPr>
+        <w:t xml:space="preserve">4. </w:t>
+      </w:r>
       <w:r>
         <w:t>Round 3 — AI amplification. Prompt: 'Give 15 diverse solution concepts for [your HMW question], including 3 deliberately unconventional ones.'</w:t>
       </w:r>
     </w:p>
     <w:p>
       <w:pPr>
-        <w:pStyle w:val="ListNumber"/>
-      </w:pPr>
+        <w:ind w:left="432"/>
+      </w:pPr>
+      <w:r>
+        <w:rPr>
+          <w:b/>
+        </w:rPr>
+        <w:t xml:space="preserve">5. </w:t>
+      </w:r>
       <w:r>
         <w:t>Post only the AI ideas that add something your group did not already have.</w:t>
       </w:r>
     </w:p>
     <w:p>
       <w:pPr>
-        <w:pStyle w:val="ListNumber"/>
-      </w:pPr>
+        <w:ind w:left="432"/>
+      </w:pPr>
+      <w:r>
+        <w:rPr>
+          <w:b/>
+        </w:rPr>
+        <w:t xml:space="preserve">6. </w:t>
+      </w:r>
       <w:r>
         <w:t>Group everything into themes using Idea Categories.</w:t>
       </w:r>
     </w:p>
     <w:p>
       <w:pPr>
-        <w:pStyle w:val="ListNumber"/>
-      </w:pPr>
+        <w:ind w:left="432"/>
+      </w:pPr>
+      <w:r>
+        <w:rPr>
+          <w:b/>
+        </w:rPr>
+        <w:t xml:space="preserve">7. </w:t>
+      </w:r>
       <w:r>
         <w:t>Dot vote in Voting &amp; Prioritisation and shortlist the top three concepts.</w:t>
       </w:r>
     </w:p>
     <w:p>
       <w:pPr>
-        <w:pStyle w:val="ListNumber"/>
-      </w:pPr>
+        <w:ind w:left="432"/>
+      </w:pPr>
+      <w:r>
+        <w:rPr>
+          <w:b/>
+        </w:rPr>
+        <w:t xml:space="preserve">8. </w:t>
+      </w:r>
       <w:r>
         <w:t>Record in the workspace which of the three shortlisted ideas came from a human and which from the AI.</w:t>
       </w:r>
@@ -8311,40 +8839,70 @@
     </w:p>
     <w:p>
       <w:pPr>
-        <w:pStyle w:val="ListNumber"/>
-      </w:pPr>
+        <w:ind w:left="432"/>
+      </w:pPr>
+      <w:r>
+        <w:rPr>
+          <w:b/>
+        </w:rPr>
+        <w:t xml:space="preserve">1. </w:t>
+      </w:r>
       <w:r>
         <w:t>IDEO's rules include 'defer judgement' and 'encourage wild ideas'. What actually happens in a meeting when these are not enforced?</w:t>
       </w:r>
     </w:p>
     <w:p>
       <w:pPr>
-        <w:pStyle w:val="ListNumber"/>
-      </w:pPr>
+        <w:ind w:left="432"/>
+      </w:pPr>
+      <w:r>
+        <w:rPr>
+          <w:b/>
+        </w:rPr>
+        <w:t xml:space="preserve">2. </w:t>
+      </w:r>
       <w:r>
         <w:t>You generated ideas manually, then with AI. Compare the two sets — which was more diverse, and which was more useful?</w:t>
       </w:r>
     </w:p>
     <w:p>
       <w:pPr>
-        <w:pStyle w:val="ListNumber"/>
-      </w:pPr>
+        <w:ind w:left="432"/>
+      </w:pPr>
+      <w:r>
+        <w:rPr>
+          <w:b/>
+        </w:rPr>
+        <w:t xml:space="preserve">3. </w:t>
+      </w:r>
       <w:r>
         <w:t>The cart was never mass-produced. What is the value of a prototype that was never meant to ship?</w:t>
       </w:r>
     </w:p>
     <w:p>
       <w:pPr>
-        <w:pStyle w:val="ListNumber"/>
-      </w:pPr>
+        <w:ind w:left="432"/>
+      </w:pPr>
+      <w:r>
+        <w:rPr>
+          <w:b/>
+        </w:rPr>
+        <w:t xml:space="preserve">4. </w:t>
+      </w:r>
       <w:r>
         <w:t>Under what conditions does GenAI reduce the diversity of ideas in a room instead of increasing it?</w:t>
       </w:r>
     </w:p>
     <w:p>
       <w:pPr>
-        <w:pStyle w:val="ListNumber"/>
-      </w:pPr>
+        <w:ind w:left="432"/>
+      </w:pPr>
+      <w:r>
+        <w:rPr>
+          <w:b/>
+        </w:rPr>
+        <w:t xml:space="preserve">5. </w:t>
+      </w:r>
       <w:r>
         <w:t>Who should have the final vote on which idea proceeds — and what does that choice say about your organisation?</w:t>
       </w:r>
@@ -8480,64 +9038,112 @@
     </w:p>
     <w:p>
       <w:pPr>
-        <w:pStyle w:val="ListNumber"/>
-      </w:pPr>
+        <w:ind w:left="432"/>
+      </w:pPr>
+      <w:r>
+        <w:rPr>
+          <w:b/>
+        </w:rPr>
+        <w:t xml:space="preserve">1. </w:t>
+      </w:r>
       <w:r>
         <w:t>Open the Prototype stage in the Design Thinking Studio workspace.</w:t>
       </w:r>
     </w:p>
     <w:p>
       <w:pPr>
-        <w:pStyle w:val="ListNumber"/>
-      </w:pPr>
+        <w:ind w:left="432"/>
+      </w:pPr>
+      <w:r>
+        <w:rPr>
+          <w:b/>
+        </w:rPr>
+        <w:t xml:space="preserve">2. </w:t>
+      </w:r>
       <w:r>
         <w:t>Post your concept in one paragraph into Prototype Description.</w:t>
       </w:r>
     </w:p>
     <w:p>
       <w:pPr>
-        <w:pStyle w:val="ListNumber"/>
-      </w:pPr>
+        <w:ind w:left="432"/>
+      </w:pPr>
+      <w:r>
+        <w:rPr>
+          <w:b/>
+        </w:rPr>
+        <w:t xml:space="preserve">3. </w:t>
+      </w:r>
       <w:r>
         <w:t>Prompt the AI: 'Draft the user flow and screen-by-screen copy for [your concept]. Flag the three steps most likely to cause drop-off.'</w:t>
       </w:r>
     </w:p>
     <w:p>
       <w:pPr>
-        <w:pStyle w:val="ListNumber"/>
-      </w:pPr>
+        <w:ind w:left="432"/>
+      </w:pPr>
+      <w:r>
+        <w:rPr>
+          <w:b/>
+        </w:rPr>
+        <w:t xml:space="preserve">4. </w:t>
+      </w:r>
       <w:r>
         <w:t>Post the flow into User Flow and the key screens into Screens / Wireframes.</w:t>
       </w:r>
     </w:p>
     <w:p>
       <w:pPr>
-        <w:pStyle w:val="ListNumber"/>
-      </w:pPr>
+        <w:ind w:left="432"/>
+      </w:pPr>
+      <w:r>
+        <w:rPr>
+          <w:b/>
+        </w:rPr>
+        <w:t xml:space="preserve">5. </w:t>
+      </w:r>
       <w:r>
         <w:t>List every assumption your concept depends on in Assumptions — be ruthless.</w:t>
       </w:r>
     </w:p>
     <w:p>
       <w:pPr>
-        <w:pStyle w:val="ListNumber"/>
-      </w:pPr>
+        <w:ind w:left="432"/>
+      </w:pPr>
+      <w:r>
+        <w:rPr>
+          <w:b/>
+        </w:rPr>
+        <w:t xml:space="preserve">6. </w:t>
+      </w:r>
       <w:r>
         <w:t>Optionally use Adobe Firefly to generate a visual for the concept.</w:t>
       </w:r>
     </w:p>
     <w:p>
       <w:pPr>
-        <w:pStyle w:val="ListNumber"/>
-      </w:pPr>
+        <w:ind w:left="432"/>
+      </w:pPr>
+      <w:r>
+        <w:rPr>
+          <w:b/>
+        </w:rPr>
+        <w:t xml:space="preserve">7. </w:t>
+      </w:r>
       <w:r>
         <w:t>Move to the Test stage and write a Test Plan: who you would test with, the task you would set, and what result would prove you wrong.</w:t>
       </w:r>
     </w:p>
     <w:p>
       <w:pPr>
-        <w:pStyle w:val="ListNumber"/>
-      </w:pPr>
+        <w:ind w:left="432"/>
+      </w:pPr>
+      <w:r>
+        <w:rPr>
+          <w:b/>
+        </w:rPr>
+        <w:t xml:space="preserve">8. </w:t>
+      </w:r>
       <w:r>
         <w:t>Swap workspaces with another group, run their prototype as a user, and post honest feedback into their User Feedback section.</w:t>
       </w:r>
@@ -8554,40 +9160,70 @@
     </w:p>
     <w:p>
       <w:pPr>
-        <w:pStyle w:val="ListNumber"/>
-      </w:pPr>
+        <w:ind w:left="432"/>
+      </w:pPr>
+      <w:r>
+        <w:rPr>
+          <w:b/>
+        </w:rPr>
+        <w:t xml:space="preserve">1. </w:t>
+      </w:r>
       <w:r>
         <w:t>The kiosk team learned the real barrier was privacy, not usability. Which of your assumptions, if wrong, would sink your concept fastest?</w:t>
       </w:r>
     </w:p>
     <w:p>
       <w:pPr>
-        <w:pStyle w:val="ListNumber"/>
-      </w:pPr>
+        <w:ind w:left="432"/>
+      </w:pPr>
+      <w:r>
+        <w:rPr>
+          <w:b/>
+        </w:rPr>
+        <w:t xml:space="preserve">2. </w:t>
+      </w:r>
       <w:r>
         <w:t>What is the cheapest possible artefact that would still generate a real reaction from a real user?</w:t>
       </w:r>
     </w:p>
     <w:p>
       <w:pPr>
-        <w:pStyle w:val="ListNumber"/>
-      </w:pPr>
+        <w:ind w:left="432"/>
+      </w:pPr>
+      <w:r>
+        <w:rPr>
+          <w:b/>
+        </w:rPr>
+        <w:t xml:space="preserve">3. </w:t>
+      </w:r>
       <w:r>
         <w:t>'Build to think, not to ship.' What is the risk of a prototype that looks too polished?</w:t>
       </w:r>
     </w:p>
     <w:p>
       <w:pPr>
-        <w:pStyle w:val="ListNumber"/>
-      </w:pPr>
+        <w:ind w:left="432"/>
+      </w:pPr>
+      <w:r>
+        <w:rPr>
+          <w:b/>
+        </w:rPr>
+        <w:t xml:space="preserve">4. </w:t>
+      </w:r>
       <w:r>
         <w:t>Where did GenAI genuinely save time here, and where would relying on it have hidden the privacy insight?</w:t>
       </w:r>
     </w:p>
     <w:p>
       <w:pPr>
-        <w:pStyle w:val="ListNumber"/>
-      </w:pPr>
+        <w:ind w:left="432"/>
+      </w:pPr>
+      <w:r>
+        <w:rPr>
+          <w:b/>
+        </w:rPr>
+        <w:t xml:space="preserve">5. </w:t>
+      </w:r>
       <w:r>
         <w:t>Write the one question you would ask a test user that could prove your concept wrong.</w:t>
       </w:r>
@@ -8723,56 +9359,98 @@
     </w:p>
     <w:p>
       <w:pPr>
-        <w:pStyle w:val="ListNumber"/>
-      </w:pPr>
+        <w:ind w:left="432"/>
+      </w:pPr>
+      <w:r>
+        <w:rPr>
+          <w:b/>
+        </w:rPr>
+        <w:t xml:space="preserve">1. </w:t>
+      </w:r>
       <w:r>
         <w:t>Rejoin the Padlet classroom board and open the Activity 7 section.</w:t>
       </w:r>
     </w:p>
     <w:p>
       <w:pPr>
-        <w:pStyle w:val="ListNumber"/>
-      </w:pPr>
+        <w:ind w:left="432"/>
+      </w:pPr>
+      <w:r>
+        <w:rPr>
+          <w:b/>
+        </w:rPr>
+        <w:t xml:space="preserve">2. </w:t>
+      </w:r>
       <w:r>
         <w:t>Read the Spotify case in the Learner Guide (Activity 7) with your group.</w:t>
       </w:r>
     </w:p>
     <w:p>
       <w:pPr>
-        <w:pStyle w:val="ListNumber"/>
-      </w:pPr>
+        <w:ind w:left="432"/>
+      </w:pPr>
+      <w:r>
+        <w:rPr>
+          <w:b/>
+        </w:rPr>
+        <w:t xml:space="preserve">3. </w:t>
+      </w:r>
       <w:r>
         <w:t>In the sub-section 'Structures', post the parts of the model that are organisational artefacts.</w:t>
       </w:r>
     </w:p>
     <w:p>
       <w:pPr>
-        <w:pStyle w:val="ListNumber"/>
-      </w:pPr>
+        <w:ind w:left="432"/>
+      </w:pPr>
+      <w:r>
+        <w:rPr>
+          <w:b/>
+        </w:rPr>
+        <w:t xml:space="preserve">4. </w:t>
+      </w:r>
       <w:r>
         <w:t>In the sub-section 'Principles', post the underlying beliefs that made those artefacts work.</w:t>
       </w:r>
     </w:p>
     <w:p>
       <w:pPr>
-        <w:pStyle w:val="ListNumber"/>
-      </w:pPr>
+        <w:ind w:left="432"/>
+      </w:pPr>
+      <w:r>
+        <w:rPr>
+          <w:b/>
+        </w:rPr>
+        <w:t xml:space="preserve">5. </w:t>
+      </w:r>
       <w:r>
         <w:t>Ask ChatGPT: 'What conditions must be true in an organisation for autonomous squads to outperform a functional hierarchy?' and evaluate its answer critically.</w:t>
       </w:r>
     </w:p>
     <w:p>
       <w:pPr>
-        <w:pStyle w:val="ListNumber"/>
-      </w:pPr>
+        <w:ind w:left="432"/>
+      </w:pPr>
+      <w:r>
+        <w:rPr>
+          <w:b/>
+        </w:rPr>
+        <w:t xml:space="preserve">6. </w:t>
+      </w:r>
       <w:r>
         <w:t>Draft your counter-proposal: one team, one quarter, one measurable outcome. Post it.</w:t>
       </w:r>
     </w:p>
     <w:p>
       <w:pPr>
-        <w:pStyle w:val="ListNumber"/>
-      </w:pPr>
+        <w:ind w:left="432"/>
+      </w:pPr>
+      <w:r>
+        <w:rPr>
+          <w:b/>
+        </w:rPr>
+        <w:t xml:space="preserve">7. </w:t>
+      </w:r>
       <w:r>
         <w:t>Read another group's counter-proposal and comment with the biggest risk you see in it.</w:t>
       </w:r>
@@ -8789,40 +9467,70 @@
     </w:p>
     <w:p>
       <w:pPr>
-        <w:pStyle w:val="ListNumber"/>
-      </w:pPr>
+        <w:ind w:left="432"/>
+      </w:pPr>
+      <w:r>
+        <w:rPr>
+          <w:b/>
+        </w:rPr>
+        <w:t xml:space="preserve">1. </w:t>
+      </w:r>
       <w:r>
         <w:t>Spotify's own authors say do not copy it. Why did hundreds of organisations copy it anyway?</w:t>
       </w:r>
     </w:p>
     <w:p>
       <w:pPr>
-        <w:pStyle w:val="ListNumber"/>
-      </w:pPr>
+        <w:ind w:left="432"/>
+      </w:pPr>
+      <w:r>
+        <w:rPr>
+          <w:b/>
+        </w:rPr>
+        <w:t xml:space="preserve">2. </w:t>
+      </w:r>
       <w:r>
         <w:t>Separate the list: which parts of the model are structures (copyable) and which are cultures (not directly copyable)?</w:t>
       </w:r>
     </w:p>
     <w:p>
       <w:pPr>
-        <w:pStyle w:val="ListNumber"/>
-      </w:pPr>
+        <w:ind w:left="432"/>
+      </w:pPr>
+      <w:r>
+        <w:rPr>
+          <w:b/>
+        </w:rPr>
+        <w:t xml:space="preserve">3. </w:t>
+      </w:r>
       <w:r>
         <w:t>'Practices without principles are a short-lived Band-Aid. And principles without practices are a fruitless exercise in philosophy.' Give a workplace example of each failure mode.</w:t>
       </w:r>
     </w:p>
     <w:p>
       <w:pPr>
-        <w:pStyle w:val="ListNumber"/>
-      </w:pPr>
+        <w:ind w:left="432"/>
+      </w:pPr>
+      <w:r>
+        <w:rPr>
+          <w:b/>
+        </w:rPr>
+        <w:t xml:space="preserve">4. </w:t>
+      </w:r>
       <w:r>
         <w:t>Your management wants it done by Q4. Write the one question that reframes the request without being insubordinate.</w:t>
       </w:r>
     </w:p>
     <w:p>
       <w:pPr>
-        <w:pStyle w:val="ListNumber"/>
-      </w:pPr>
+        <w:ind w:left="432"/>
+      </w:pPr>
+      <w:r>
+        <w:rPr>
+          <w:b/>
+        </w:rPr>
+        <w:t xml:space="preserve">5. </w:t>
+      </w:r>
       <w:r>
         <w:t>How might GenAI help you assess organisational readiness before a rollout — and what would it get wrong?</w:t>
       </w:r>
@@ -8958,64 +9666,112 @@
     </w:p>
     <w:p>
       <w:pPr>
-        <w:pStyle w:val="ListNumber"/>
-      </w:pPr>
+        <w:ind w:left="432"/>
+      </w:pPr>
+      <w:r>
+        <w:rPr>
+          <w:b/>
+        </w:rPr>
+        <w:t xml:space="preserve">1. </w:t>
+      </w:r>
       <w:r>
         <w:t>Open the Padlet classroom board, Activity 8 section.</w:t>
       </w:r>
     </w:p>
     <w:p>
       <w:pPr>
-        <w:pStyle w:val="ListNumber"/>
-      </w:pPr>
+        <w:ind w:left="432"/>
+      </w:pPr>
+      <w:r>
+        <w:rPr>
+          <w:b/>
+        </w:rPr>
+        <w:t xml:space="preserve">2. </w:t>
+      </w:r>
       <w:r>
         <w:t>Write ONE Hill for your concept: 'As a [who], I want [what], so that [wow]'. Make the wow measurable.</w:t>
       </w:r>
     </w:p>
     <w:p>
       <w:pPr>
-        <w:pStyle w:val="ListNumber"/>
-      </w:pPr>
+        <w:ind w:left="432"/>
+      </w:pPr>
+      <w:r>
+        <w:rPr>
+          <w:b/>
+        </w:rPr>
+        <w:t xml:space="preserve">3. </w:t>
+      </w:r>
       <w:r>
         <w:t>Post the Hill and have another group challenge its measurability. Revise it.</w:t>
       </w:r>
     </w:p>
     <w:p>
       <w:pPr>
-        <w:pStyle w:val="ListNumber"/>
-      </w:pPr>
+        <w:ind w:left="432"/>
+      </w:pPr>
+      <w:r>
+        <w:rPr>
+          <w:b/>
+        </w:rPr>
+        <w:t xml:space="preserve">4. </w:t>
+      </w:r>
       <w:r>
         <w:t>Prompt the AI: 'Convert this Hill into 10 user stories in the form As a/I want/so that, each with 2-3 testable acceptance criteria.'</w:t>
       </w:r>
     </w:p>
     <w:p>
       <w:pPr>
-        <w:pStyle w:val="ListNumber"/>
-      </w:pPr>
+        <w:ind w:left="432"/>
+      </w:pPr>
+      <w:r>
+        <w:rPr>
+          <w:b/>
+        </w:rPr>
+        <w:t xml:space="preserve">5. </w:t>
+      </w:r>
       <w:r>
         <w:t>Review every story. Delete the ones that assume something you never validated. Rewrite the weak acceptance criteria.</w:t>
       </w:r>
     </w:p>
     <w:p>
       <w:pPr>
-        <w:pStyle w:val="ListNumber"/>
-      </w:pPr>
+        <w:ind w:left="432"/>
+      </w:pPr>
+      <w:r>
+        <w:rPr>
+          <w:b/>
+        </w:rPr>
+        <w:t xml:space="preserve">6. </w:t>
+      </w:r>
       <w:r>
         <w:t>Split the surviving stories into Cupcake, Birthday Cake and Wedding Cake releases.</w:t>
       </w:r>
     </w:p>
     <w:p>
       <w:pPr>
-        <w:pStyle w:val="ListNumber"/>
-      </w:pPr>
+        <w:ind w:left="432"/>
+      </w:pPr>
+      <w:r>
+        <w:rPr>
+          <w:b/>
+        </w:rPr>
+        <w:t xml:space="preserve">7. </w:t>
+      </w:r>
       <w:r>
         <w:t>Size the Cupcake stories using relative points (1, 2, 3, 5, 8) — discuss any estimate where the group differs by more than two cards.</w:t>
       </w:r>
     </w:p>
     <w:p>
       <w:pPr>
-        <w:pStyle w:val="ListNumber"/>
-      </w:pPr>
+        <w:ind w:left="432"/>
+      </w:pPr>
+      <w:r>
+        <w:rPr>
+          <w:b/>
+        </w:rPr>
+        <w:t xml:space="preserve">8. </w:t>
+      </w:r>
       <w:r>
         <w:t>Post your final release-one backlog to Padlet and Like the backlog you would most want to inherit as a developer.</w:t>
       </w:r>
@@ -9032,40 +9788,70 @@
     </w:p>
     <w:p>
       <w:pPr>
-        <w:pStyle w:val="ListNumber"/>
-      </w:pPr>
+        <w:ind w:left="432"/>
+      </w:pPr>
+      <w:r>
+        <w:rPr>
+          <w:b/>
+        </w:rPr>
+        <w:t xml:space="preserve">1. </w:t>
+      </w:r>
       <w:r>
         <w:t>Compare a Hill ('so that [wow]') with a user story ('so that [reason]'). What does the Hill capture that the story loses?</w:t>
       </w:r>
     </w:p>
     <w:p>
       <w:pPr>
-        <w:pStyle w:val="ListNumber"/>
-      </w:pPr>
+        <w:ind w:left="432"/>
+      </w:pPr>
+      <w:r>
+        <w:rPr>
+          <w:b/>
+        </w:rPr>
+        <w:t xml:space="preserve">2. </w:t>
+      </w:r>
       <w:r>
         <w:t>The team pushed 'in minutes' to '5 minutes'. What forced the specificity, and what would have happened without it?</w:t>
       </w:r>
     </w:p>
     <w:p>
       <w:pPr>
-        <w:pStyle w:val="ListNumber"/>
-      </w:pPr>
+        <w:ind w:left="432"/>
+      </w:pPr>
+      <w:r>
+        <w:rPr>
+          <w:b/>
+        </w:rPr>
+        <w:t xml:space="preserve">3. </w:t>
+      </w:r>
       <w:r>
         <w:t>Review the AI-generated stories. What did it get structurally right, and what did it get wrong about your context?</w:t>
       </w:r>
     </w:p>
     <w:p>
       <w:pPr>
-        <w:pStyle w:val="ListNumber"/>
-      </w:pPr>
+        <w:ind w:left="432"/>
+      </w:pPr>
+      <w:r>
+        <w:rPr>
+          <w:b/>
+        </w:rPr>
+        <w:t xml:space="preserve">4. </w:t>
+      </w:r>
       <w:r>
         <w:t>Explain 'Cupcake' to someone who thinks an MVP is 'version one with features removed'. Where is the difference?</w:t>
       </w:r>
     </w:p>
     <w:p>
       <w:pPr>
-        <w:pStyle w:val="ListNumber"/>
-      </w:pPr>
+        <w:ind w:left="432"/>
+      </w:pPr>
+      <w:r>
+        <w:rPr>
+          <w:b/>
+        </w:rPr>
+        <w:t xml:space="preserve">5. </w:t>
+      </w:r>
       <w:r>
         <w:t>Story points measure size and complexity, not duration. Why does the distinction matter for a team's velocity?</w:t>
       </w:r>
@@ -9201,64 +9987,112 @@
     </w:p>
     <w:p>
       <w:pPr>
-        <w:pStyle w:val="ListNumber"/>
-      </w:pPr>
+        <w:ind w:left="432"/>
+      </w:pPr>
+      <w:r>
+        <w:rPr>
+          <w:b/>
+        </w:rPr>
+        <w:t xml:space="preserve">1. </w:t>
+      </w:r>
       <w:r>
         <w:t>Assign roles in your group: Product Owner, Scrum Master, and 2-3 Developers.</w:t>
       </w:r>
     </w:p>
     <w:p>
       <w:pPr>
-        <w:pStyle w:val="ListNumber"/>
-      </w:pPr>
+        <w:ind w:left="432"/>
+      </w:pPr>
+      <w:r>
+        <w:rPr>
+          <w:b/>
+        </w:rPr>
+        <w:t xml:space="preserve">2. </w:t>
+      </w:r>
       <w:r>
         <w:t>Sprint Planning — agree a one-sentence sprint goal and pull Cupcake stories that fit. Post to Padlet.</w:t>
       </w:r>
     </w:p>
     <w:p>
       <w:pPr>
-        <w:pStyle w:val="ListNumber"/>
-      </w:pPr>
+        <w:ind w:left="432"/>
+      </w:pPr>
+      <w:r>
+        <w:rPr>
+          <w:b/>
+        </w:rPr>
+        <w:t xml:space="preserve">3. </w:t>
+      </w:r>
       <w:r>
         <w:t>Run a 3-minute stand-up: each person states progress, next step and blockers.</w:t>
       </w:r>
     </w:p>
     <w:p>
       <w:pPr>
-        <w:pStyle w:val="ListNumber"/>
-      </w:pPr>
+        <w:ind w:left="432"/>
+      </w:pPr>
+      <w:r>
+        <w:rPr>
+          <w:b/>
+        </w:rPr>
+        <w:t xml:space="preserve">4. </w:t>
+      </w:r>
       <w:r>
         <w:t>The trainer introduces the mid-sprint disruption. Decide as a team: absorb, defer, or swap. Document the decision AND the reasoning.</w:t>
       </w:r>
     </w:p>
     <w:p>
       <w:pPr>
-        <w:pStyle w:val="ListNumber"/>
-      </w:pPr>
+        <w:ind w:left="432"/>
+      </w:pPr>
+      <w:r>
+        <w:rPr>
+          <w:b/>
+        </w:rPr>
+        <w:t xml:space="preserve">5. </w:t>
+      </w:r>
       <w:r>
         <w:t>In parallel, run the discovery track — open the Test stage in the Design Thinking Studio and log what you would validate before the new request enters a sprint.</w:t>
       </w:r>
     </w:p>
     <w:p>
       <w:pPr>
-        <w:pStyle w:val="ListNumber"/>
-      </w:pPr>
+        <w:ind w:left="432"/>
+      </w:pPr>
+      <w:r>
+        <w:rPr>
+          <w:b/>
+        </w:rPr>
+        <w:t xml:space="preserve">6. </w:t>
+      </w:r>
       <w:r>
         <w:t>Sprint Review — present your Cupcake increment to another group acting as stakeholders and capture their feedback.</w:t>
       </w:r>
     </w:p>
     <w:p>
       <w:pPr>
-        <w:pStyle w:val="ListNumber"/>
-      </w:pPr>
+        <w:ind w:left="432"/>
+      </w:pPr>
+      <w:r>
+        <w:rPr>
+          <w:b/>
+        </w:rPr>
+        <w:t xml:space="preserve">7. </w:t>
+      </w:r>
       <w:r>
         <w:t>Retrospective — each person posts one Keep, one Drop, one Try. Then ask the AI to cluster the themes.</w:t>
       </w:r>
     </w:p>
     <w:p>
       <w:pPr>
-        <w:pStyle w:val="ListNumber"/>
-      </w:pPr>
+        <w:ind w:left="432"/>
+      </w:pPr>
+      <w:r>
+        <w:rPr>
+          <w:b/>
+        </w:rPr>
+        <w:t xml:space="preserve">8. </w:t>
+      </w:r>
       <w:r>
         <w:t>Compare the AI's clustering with your own reading of the room, and agree three concrete actions.</w:t>
       </w:r>
@@ -9275,40 +10109,70 @@
     </w:p>
     <w:p>
       <w:pPr>
-        <w:pStyle w:val="ListNumber"/>
-      </w:pPr>
+        <w:ind w:left="432"/>
+      </w:pPr>
+      <w:r>
+        <w:rPr>
+          <w:b/>
+        </w:rPr>
+        <w:t xml:space="preserve">1. </w:t>
+      </w:r>
       <w:r>
         <w:t>A stakeholder interrupts mid-sprint. What are your options, and what does each one cost in trust, focus and delivery?</w:t>
       </w:r>
     </w:p>
     <w:p>
       <w:pPr>
-        <w:pStyle w:val="ListNumber"/>
-      </w:pPr>
+        <w:ind w:left="432"/>
+      </w:pPr>
+      <w:r>
+        <w:rPr>
+          <w:b/>
+        </w:rPr>
+        <w:t xml:space="preserve">2. </w:t>
+      </w:r>
       <w:r>
         <w:t>Cagan calls handoffs 'little mini-waterfalls'. Where do handoffs disguised as collaboration happen in your organisation?</w:t>
       </w:r>
     </w:p>
     <w:p>
       <w:pPr>
-        <w:pStyle w:val="ListNumber"/>
-      </w:pPr>
+        <w:ind w:left="432"/>
+      </w:pPr>
+      <w:r>
+        <w:rPr>
+          <w:b/>
+        </w:rPr>
+        <w:t xml:space="preserve">3. </w:t>
+      </w:r>
       <w:r>
         <w:t>Discovery's job is partly to kill ideas. Why is killing an idea a success, and why do organisations rarely reward it?</w:t>
       </w:r>
     </w:p>
     <w:p>
       <w:pPr>
-        <w:pStyle w:val="ListNumber"/>
-      </w:pPr>
+        <w:ind w:left="432"/>
+      </w:pPr>
+      <w:r>
+        <w:rPr>
+          <w:b/>
+        </w:rPr>
+        <w:t xml:space="preserve">4. </w:t>
+      </w:r>
       <w:r>
         <w:t>Which ceremony did GenAI genuinely improve, and which one would it damage if you let it run unsupervised?</w:t>
       </w:r>
     </w:p>
     <w:p>
       <w:pPr>
-        <w:pStyle w:val="ListNumber"/>
-      </w:pPr>
+        <w:ind w:left="432"/>
+      </w:pPr>
+      <w:r>
+        <w:rPr>
+          <w:b/>
+        </w:rPr>
+        <w:t xml:space="preserve">5. </w:t>
+      </w:r>
       <w:r>
         <w:t>Your velocity drops because the team spent time on discovery. How do you explain that to a manager who only tracks delivery?</w:t>
       </w:r>
@@ -9444,56 +10308,98 @@
     </w:p>
     <w:p>
       <w:pPr>
-        <w:pStyle w:val="ListNumber"/>
-      </w:pPr>
+        <w:ind w:left="432"/>
+      </w:pPr>
+      <w:r>
+        <w:rPr>
+          <w:b/>
+        </w:rPr>
+        <w:t xml:space="preserve">1. </w:t>
+      </w:r>
       <w:r>
         <w:t>Rejoin the Padlet classroom board, Activity 10 section.</w:t>
       </w:r>
     </w:p>
     <w:p>
       <w:pPr>
-        <w:pStyle w:val="ListNumber"/>
-      </w:pPr>
+        <w:ind w:left="432"/>
+      </w:pPr>
+      <w:r>
+        <w:rPr>
+          <w:b/>
+        </w:rPr>
+        <w:t xml:space="preserve">2. </w:t>
+      </w:r>
       <w:r>
         <w:t>Read the DBS case in the Learner Guide (Activity 10) with your group.</w:t>
       </w:r>
     </w:p>
     <w:p>
       <w:pPr>
-        <w:pStyle w:val="ListNumber"/>
-      </w:pPr>
+        <w:ind w:left="432"/>
+      </w:pPr>
+      <w:r>
+        <w:rPr>
+          <w:b/>
+        </w:rPr>
+        <w:t xml:space="preserve">3. </w:t>
+      </w:r>
       <w:r>
         <w:t>Post the three mechanisms DBS used that were NOT training.</w:t>
       </w:r>
     </w:p>
     <w:p>
       <w:pPr>
-        <w:pStyle w:val="ListNumber"/>
-      </w:pPr>
+        <w:ind w:left="432"/>
+      </w:pPr>
+      <w:r>
+        <w:rPr>
+          <w:b/>
+        </w:rPr>
+        <w:t xml:space="preserve">4. </w:t>
+      </w:r>
       <w:r>
         <w:t>For your own organisation, post one metric you would change and what behaviour that change would trigger.</w:t>
       </w:r>
     </w:p>
     <w:p>
       <w:pPr>
-        <w:pStyle w:val="ListNumber"/>
-      </w:pPr>
+        <w:ind w:left="432"/>
+      </w:pPr>
+      <w:r>
+        <w:rPr>
+          <w:b/>
+        </w:rPr>
+        <w:t xml:space="preserve">5. </w:t>
+      </w:r>
       <w:r>
         <w:t>Ask ChatGPT: 'What are the most common failure modes when scaling design thinking in a large regulated organisation?' Evaluate its list against the DBS case.</w:t>
       </w:r>
     </w:p>
     <w:p>
       <w:pPr>
-        <w:pStyle w:val="ListNumber"/>
-      </w:pPr>
+        <w:ind w:left="432"/>
+      </w:pPr>
+      <w:r>
+        <w:rPr>
+          <w:b/>
+        </w:rPr>
+        <w:t xml:space="preserve">6. </w:t>
+      </w:r>
       <w:r>
         <w:t>Draft your 90-day scaling plan: scope, metric, leadership behaviour, first team.</w:t>
       </w:r>
     </w:p>
     <w:p>
       <w:pPr>
-        <w:pStyle w:val="ListNumber"/>
-      </w:pPr>
+        <w:ind w:left="432"/>
+      </w:pPr>
+      <w:r>
+        <w:rPr>
+          <w:b/>
+        </w:rPr>
+        <w:t xml:space="preserve">7. </w:t>
+      </w:r>
       <w:r>
         <w:t>Post it and comment on another group's plan, naming the assumption most likely to break.</w:t>
       </w:r>
@@ -9510,40 +10416,70 @@
     </w:p>
     <w:p>
       <w:pPr>
-        <w:pStyle w:val="ListNumber"/>
-      </w:pPr>
+        <w:ind w:left="432"/>
+      </w:pPr>
+      <w:r>
+        <w:rPr>
+          <w:b/>
+        </w:rPr>
+        <w:t xml:space="preserve">1. </w:t>
+      </w:r>
       <w:r>
         <w:t>DBS measured 'customer hours saved'. Why is that a more powerful scaling lever than counting how many staff attended training?</w:t>
       </w:r>
     </w:p>
     <w:p>
       <w:pPr>
-        <w:pStyle w:val="ListNumber"/>
-      </w:pPr>
+        <w:ind w:left="432"/>
+      </w:pPr>
+      <w:r>
+        <w:rPr>
+          <w:b/>
+        </w:rPr>
+        <w:t xml:space="preserve">2. </w:t>
+      </w:r>
       <w:r>
         <w:t>Your director offers no budget and no KPI change. What is the honest risk to the rollout, and how do you surface it professionally?</w:t>
       </w:r>
     </w:p>
     <w:p>
       <w:pPr>
-        <w:pStyle w:val="ListNumber"/>
-      </w:pPr>
+        <w:ind w:left="432"/>
+      </w:pPr>
+      <w:r>
+        <w:rPr>
+          <w:b/>
+        </w:rPr>
+        <w:t xml:space="preserve">3. </w:t>
+      </w:r>
       <w:r>
         <w:t>DBS required leaders to participate rather than sponsor. What is the practical difference, and which does your organisation do?</w:t>
       </w:r>
     </w:p>
     <w:p>
       <w:pPr>
-        <w:pStyle w:val="ListNumber"/>
-      </w:pPr>
+        <w:ind w:left="432"/>
+      </w:pPr>
+      <w:r>
+        <w:rPr>
+          <w:b/>
+        </w:rPr>
+        <w:t xml:space="preserve">4. </w:t>
+      </w:r>
       <w:r>
         <w:t>Which is harder to scale — the method, the mindset, or the authority to act on what you learn? Defend your ranking.</w:t>
       </w:r>
     </w:p>
     <w:p>
       <w:pPr>
-        <w:pStyle w:val="ListNumber"/>
-      </w:pPr>
+        <w:ind w:left="432"/>
+      </w:pPr>
+      <w:r>
+        <w:rPr>
+          <w:b/>
+        </w:rPr>
+        <w:t xml:space="preserve">5. </w:t>
+      </w:r>
       <w:r>
         <w:t>Where would GenAI genuinely accelerate a 400-person rollout, and where would it create the illusion of progress?</w:t>
       </w:r>
@@ -9679,64 +10615,112 @@
     </w:p>
     <w:p>
       <w:pPr>
-        <w:pStyle w:val="ListNumber"/>
-      </w:pPr>
+        <w:ind w:left="432"/>
+      </w:pPr>
+      <w:r>
+        <w:rPr>
+          <w:b/>
+        </w:rPr>
+        <w:t xml:space="preserve">1. </w:t>
+      </w:r>
       <w:r>
         <w:t>Open the Padlet classroom board, Activity 11 section.</w:t>
       </w:r>
     </w:p>
     <w:p>
       <w:pPr>
-        <w:pStyle w:val="ListNumber"/>
-      </w:pPr>
+        <w:ind w:left="432"/>
+      </w:pPr>
+      <w:r>
+        <w:rPr>
+          <w:b/>
+        </w:rPr>
+        <w:t xml:space="preserve">2. </w:t>
+      </w:r>
       <w:r>
         <w:t>Read the 737 MAX case in the Learner Guide (Activity 11).</w:t>
       </w:r>
     </w:p>
     <w:p>
       <w:pPr>
-        <w:pStyle w:val="ListNumber"/>
-      </w:pPr>
+        <w:ind w:left="432"/>
+      </w:pPr>
+      <w:r>
+        <w:rPr>
+          <w:b/>
+        </w:rPr>
+        <w:t xml:space="preserve">3. </w:t>
+      </w:r>
       <w:r>
         <w:t>On paper or in the workspace, draw the decision chain as a loop: each node is a decision, each arrow is 'made necessary'.</w:t>
       </w:r>
     </w:p>
     <w:p>
       <w:pPr>
-        <w:pStyle w:val="ListNumber"/>
-      </w:pPr>
+        <w:ind w:left="432"/>
+      </w:pPr>
+      <w:r>
+        <w:rPr>
+          <w:b/>
+        </w:rPr>
+        <w:t xml:space="preserve">4. </w:t>
+      </w:r>
       <w:r>
         <w:t>Mark on your loop the single point where a balancing mechanism would have had the most leverage.</w:t>
       </w:r>
     </w:p>
     <w:p>
       <w:pPr>
-        <w:pStyle w:val="ListNumber"/>
-      </w:pPr>
+        <w:ind w:left="432"/>
+      </w:pPr>
+      <w:r>
+        <w:rPr>
+          <w:b/>
+        </w:rPr>
+        <w:t xml:space="preserve">5. </w:t>
+      </w:r>
       <w:r>
         <w:t>Post a photo or description of your loop to Padlet.</w:t>
       </w:r>
     </w:p>
     <w:p>
       <w:pPr>
-        <w:pStyle w:val="ListNumber"/>
-      </w:pPr>
+        <w:ind w:left="432"/>
+      </w:pPr>
+      <w:r>
+        <w:rPr>
+          <w:b/>
+        </w:rPr>
+        <w:t xml:space="preserve">6. </w:t>
+      </w:r>
       <w:r>
         <w:t>Now map YOUR AI-assisted programme the same way. Identify one reinforcing loop with no balancing counterpart.</w:t>
       </w:r>
     </w:p>
     <w:p>
       <w:pPr>
-        <w:pStyle w:val="ListNumber"/>
-      </w:pPr>
+        <w:ind w:left="432"/>
+      </w:pPr>
+      <w:r>
+        <w:rPr>
+          <w:b/>
+        </w:rPr>
+        <w:t xml:space="preserve">7. </w:t>
+      </w:r>
       <w:r>
         <w:t>Ask ChatGPT to argue why your proposed balancing mechanism would be resisted, and prepare your response.</w:t>
       </w:r>
     </w:p>
     <w:p>
       <w:pPr>
-        <w:pStyle w:val="ListNumber"/>
-      </w:pPr>
+        <w:ind w:left="432"/>
+      </w:pPr>
+      <w:r>
+        <w:rPr>
+          <w:b/>
+        </w:rPr>
+        <w:t xml:space="preserve">8. </w:t>
+      </w:r>
       <w:r>
         <w:t>Post your systemic risk register entry: the loop, the leverage point, the mechanism, and who has authority to trigger it.</w:t>
       </w:r>
@@ -9753,40 +10737,70 @@
     </w:p>
     <w:p>
       <w:pPr>
-        <w:pStyle w:val="ListNumber"/>
-      </w:pPr>
+        <w:ind w:left="432"/>
+      </w:pPr>
+      <w:r>
+        <w:rPr>
+          <w:b/>
+        </w:rPr>
+        <w:t xml:space="preserve">1. </w:t>
+      </w:r>
       <w:r>
         <w:t>Trace the chain: which decision made the next one seem necessary? Where could one balancing loop have broken it?</w:t>
       </w:r>
     </w:p>
     <w:p>
       <w:pPr>
-        <w:pStyle w:val="ListNumber"/>
-      </w:pPr>
+        <w:ind w:left="432"/>
+      </w:pPr>
+      <w:r>
+        <w:rPr>
+          <w:b/>
+        </w:rPr>
+        <w:t xml:space="preserve">2. </w:t>
+      </w:r>
       <w:r>
         <w:t>Every decision was locally rational. What does that tell you about relying on individual good judgement as a safety mechanism?</w:t>
       </w:r>
     </w:p>
     <w:p>
       <w:pPr>
-        <w:pStyle w:val="ListNumber"/>
-      </w:pPr>
+        <w:ind w:left="432"/>
+      </w:pPr>
+      <w:r>
+        <w:rPr>
+          <w:b/>
+        </w:rPr>
+        <w:t xml:space="preserve">3. </w:t>
+      </w:r>
       <w:r>
         <w:t>Who in the system had the information to see the whole picture, and what stopped that information from changing the outcome?</w:t>
       </w:r>
     </w:p>
     <w:p>
       <w:pPr>
-        <w:pStyle w:val="ListNumber"/>
-      </w:pPr>
+        <w:ind w:left="432"/>
+      </w:pPr>
+      <w:r>
+        <w:rPr>
+          <w:b/>
+        </w:rPr>
+        <w:t xml:space="preserve">4. </w:t>
+      </w:r>
       <w:r>
         <w:t>Apply the same analysis to an AI-driven innovation programme. Where does speed pressure create a comparable blind spot?</w:t>
       </w:r>
     </w:p>
     <w:p>
       <w:pPr>
-        <w:pStyle w:val="ListNumber"/>
-      </w:pPr>
+        <w:ind w:left="432"/>
+      </w:pPr>
+      <w:r>
+        <w:rPr>
+          <w:b/>
+        </w:rPr>
+        <w:t xml:space="preserve">5. </w:t>
+      </w:r>
       <w:r>
         <w:t>What is the systems-thinking equivalent of 'the scanner is too loud' — the local fix that hides the real problem?</w:t>
       </w:r>
@@ -9922,64 +10936,112 @@
     </w:p>
     <w:p>
       <w:pPr>
-        <w:pStyle w:val="ListNumber"/>
-      </w:pPr>
+        <w:ind w:left="432"/>
+      </w:pPr>
+      <w:r>
+        <w:rPr>
+          <w:b/>
+        </w:rPr>
+        <w:t xml:space="preserve">1. </w:t>
+      </w:r>
       <w:r>
         <w:t>Open the Padlet classroom board, Activity 12 section.</w:t>
       </w:r>
     </w:p>
     <w:p>
       <w:pPr>
-        <w:pStyle w:val="ListNumber"/>
-      </w:pPr>
+        <w:ind w:left="432"/>
+      </w:pPr>
+      <w:r>
+        <w:rPr>
+          <w:b/>
+        </w:rPr>
+        <w:t xml:space="preserve">2. </w:t>
+      </w:r>
       <w:r>
         <w:t>List every metric your organisation currently uses to judge innovation. Be honest.</w:t>
       </w:r>
     </w:p>
     <w:p>
       <w:pPr>
-        <w:pStyle w:val="ListNumber"/>
-      </w:pPr>
+        <w:ind w:left="432"/>
+      </w:pPr>
+      <w:r>
+        <w:rPr>
+          <w:b/>
+        </w:rPr>
+        <w:t xml:space="preserve">3. </w:t>
+      </w:r>
       <w:r>
         <w:t>Apply Hubbard's test to each: 'what decision would change if this number moved?' Strike out every metric that fails.</w:t>
       </w:r>
     </w:p>
     <w:p>
       <w:pPr>
-        <w:pStyle w:val="ListNumber"/>
-      </w:pPr>
+        <w:ind w:left="432"/>
+      </w:pPr>
+      <w:r>
+        <w:rPr>
+          <w:b/>
+        </w:rPr>
+        <w:t xml:space="preserve">4. </w:t>
+      </w:r>
       <w:r>
         <w:t>Ask the AI: 'Propose 10 KPIs for an innovation programme, split into customer value, business value and societal value.'</w:t>
       </w:r>
     </w:p>
     <w:p>
       <w:pPr>
-        <w:pStyle w:val="ListNumber"/>
-      </w:pPr>
+        <w:ind w:left="432"/>
+      </w:pPr>
+      <w:r>
+        <w:rPr>
+          <w:b/>
+        </w:rPr>
+        <w:t xml:space="preserve">5. </w:t>
+      </w:r>
       <w:r>
         <w:t>Apply the decision test to the AI's list too. Note how many fail.</w:t>
       </w:r>
     </w:p>
     <w:p>
       <w:pPr>
-        <w:pStyle w:val="ListNumber"/>
-      </w:pPr>
+        <w:ind w:left="432"/>
+      </w:pPr>
+      <w:r>
+        <w:rPr>
+          <w:b/>
+        </w:rPr>
+        <w:t xml:space="preserve">6. </w:t>
+      </w:r>
       <w:r>
         <w:t>Build your four-metric scorecard: one customer, one business, one societal, one leading indicator.</w:t>
       </w:r>
     </w:p>
     <w:p>
       <w:pPr>
-        <w:pStyle w:val="ListNumber"/>
-      </w:pPr>
+        <w:ind w:left="432"/>
+      </w:pPr>
+      <w:r>
+        <w:rPr>
+          <w:b/>
+        </w:rPr>
+        <w:t xml:space="preserve">7. </w:t>
+      </w:r>
       <w:r>
         <w:t>For your concept, write one test each for problem validation, solution validation and demand validation.</w:t>
       </w:r>
     </w:p>
     <w:p>
       <w:pPr>
-        <w:pStyle w:val="ListNumber"/>
-      </w:pPr>
+        <w:ind w:left="432"/>
+      </w:pPr>
+      <w:r>
+        <w:rPr>
+          <w:b/>
+        </w:rPr>
+        <w:t xml:space="preserve">8. </w:t>
+      </w:r>
       <w:r>
         <w:t>Post your scorecard and challenge one metric on another group's board using Hubbard's test.</w:t>
       </w:r>
@@ -9996,40 +11058,70 @@
     </w:p>
     <w:p>
       <w:pPr>
-        <w:pStyle w:val="ListNumber"/>
-      </w:pPr>
+        <w:ind w:left="432"/>
+      </w:pPr>
+      <w:r>
+        <w:rPr>
+          <w:b/>
+        </w:rPr>
+        <w:t xml:space="preserve">1. </w:t>
+      </w:r>
       <w:r>
         <w:t>Apply Hubbard's test to 'number of ideas submitted'. What decision would change if it doubled? If none, why is it still so popular?</w:t>
       </w:r>
     </w:p>
     <w:p>
       <w:pPr>
-        <w:pStyle w:val="ListNumber"/>
-      </w:pPr>
+        <w:ind w:left="432"/>
+      </w:pPr>
+      <w:r>
+        <w:rPr>
+          <w:b/>
+        </w:rPr>
+        <w:t xml:space="preserve">2. </w:t>
+      </w:r>
       <w:r>
         <w:t>Separate problem validation, solution validation and demand validation. Give one test for each for your own concept.</w:t>
       </w:r>
     </w:p>
     <w:p>
       <w:pPr>
-        <w:pStyle w:val="ListNumber"/>
-      </w:pPr>
+        <w:ind w:left="432"/>
+      </w:pPr>
+      <w:r>
+        <w:rPr>
+          <w:b/>
+        </w:rPr>
+        <w:t xml:space="preserve">3. </w:t>
+      </w:r>
       <w:r>
         <w:t>Which is harder to measure — customer value, business value or societal value — and what happens when you only measure the easy one?</w:t>
       </w:r>
     </w:p>
     <w:p>
       <w:pPr>
-        <w:pStyle w:val="ListNumber"/>
-      </w:pPr>
+        <w:ind w:left="432"/>
+      </w:pPr>
+      <w:r>
+        <w:rPr>
+          <w:b/>
+        </w:rPr>
+        <w:t xml:space="preserve">4. </w:t>
+      </w:r>
       <w:r>
         <w:t>Your board wants a single number. What do you lose by giving them one, and how do you manage that?</w:t>
       </w:r>
     </w:p>
     <w:p>
       <w:pPr>
-        <w:pStyle w:val="ListNumber"/>
-      </w:pPr>
+        <w:ind w:left="432"/>
+      </w:pPr>
+      <w:r>
+        <w:rPr>
+          <w:b/>
+        </w:rPr>
+        <w:t xml:space="preserve">5. </w:t>
+      </w:r>
       <w:r>
         <w:t>How could GenAI help build this scorecard, and how could it help you fool yourself with it?</w:t>
       </w:r>
@@ -10244,40 +11336,70 @@
     </w:p>
     <w:p>
       <w:pPr>
-        <w:pStyle w:val="ListNumber"/>
-      </w:pPr>
+        <w:ind w:left="432"/>
+      </w:pPr>
+      <w:r>
+        <w:rPr>
+          <w:b/>
+        </w:rPr>
+        <w:t xml:space="preserve">1. </w:t>
+      </w:r>
       <w:r>
         <w:t>Complete the mandatory TRAQOM course feedback survey on the LMS.</w:t>
       </w:r>
     </w:p>
     <w:p>
       <w:pPr>
-        <w:pStyle w:val="ListNumber"/>
-      </w:pPr>
+        <w:ind w:left="432"/>
+      </w:pPr>
+      <w:r>
+        <w:rPr>
+          <w:b/>
+        </w:rPr>
+        <w:t xml:space="preserve">2. </w:t>
+      </w:r>
       <w:r>
         <w:t>Take the Assessment digital attendance by scanning the SSG QR code.</w:t>
       </w:r>
     </w:p>
     <w:p>
       <w:pPr>
-        <w:pStyle w:val="ListNumber"/>
-      </w:pPr>
+        <w:ind w:left="432"/>
+      </w:pPr>
+      <w:r>
+        <w:rPr>
+          <w:b/>
+        </w:rPr>
+        <w:t xml:space="preserve">3. </w:t>
+      </w:r>
       <w:r>
         <w:t>Sit the Written Assessment (SAQ), then the Case Study — one hour each, open book.</w:t>
       </w:r>
     </w:p>
     <w:p>
       <w:pPr>
-        <w:pStyle w:val="ListNumber"/>
-      </w:pPr>
+        <w:ind w:left="432"/>
+      </w:pPr>
+      <w:r>
+        <w:rPr>
+          <w:b/>
+        </w:rPr>
+        <w:t xml:space="preserve">4. </w:t>
+      </w:r>
       <w:r>
         <w:t>Submit your completed answers on the LMS at https://lms-tms.tertiaryinfotech.com.</w:t>
       </w:r>
     </w:p>
     <w:p>
       <w:pPr>
-        <w:pStyle w:val="ListNumber"/>
-      </w:pPr>
+        <w:ind w:left="432"/>
+      </w:pPr>
+      <w:r>
+        <w:rPr>
+          <w:b/>
+        </w:rPr>
+        <w:t xml:space="preserve">5. </w:t>
+      </w:r>
       <w:r>
         <w:t>Sign the Assessment Summary Record.</w:t>
       </w:r>

</xml_diff>